<commit_message>
feat: publish multi-goal journeys, rewards and refreshed interface
</commit_message>
<xml_diff>
--- a/工银e生-项目计划书（重构版）.docx
+++ b/工银e生-项目计划书（重构版）.docx
@@ -2899,7 +2899,26 @@
           <w:color w:val="1E2A4A"/>
           <w:sz w:val="32"/>
         </w:rPr>
-        <w:t>二、市场分析 / 前测分析</w:t>
+        <w:t>二、市场分析</w:t>
+      </w:r>
+      <w:r>
+        <w:rPr>
+          <w:rFonts w:hint="eastAsia" w:ascii="Times New Roman" w:hAnsi="Times New Roman" w:eastAsia="黑体"/>
+          <w:b/>
+          <w:color w:val="1E2A4A"/>
+          <w:sz w:val="32"/>
+          <w:lang w:val="en-US" w:eastAsia="zh-CN"/>
+        </w:rPr>
+        <w:t>与</w:t>
+      </w:r>
+      <w:r>
+        <w:rPr>
+          <w:rFonts w:ascii="Times New Roman" w:hAnsi="Times New Roman" w:eastAsia="黑体"/>
+          <w:b/>
+          <w:color w:val="1E2A4A"/>
+          <w:sz w:val="32"/>
+        </w:rPr>
+        <w:t>前测分析</w:t>
       </w:r>
     </w:p>
     <w:p>
@@ -2980,6 +2999,49 @@
         </w:rPr>
         <w:t>中国年轻人正在快速形成理财意识，但普遍缺少方法和陪伴。调研显示，82.73%的受访大学生有记账习惯，46.76%的人生活费偶尔有结余，31.53%经常有结余并存入储蓄；另有64.55%的学生明确表示“花钱有一定计划”。这说明年轻人已经有财务管理的意愿和基础，但多数人停留在“记账”和“存款”的初级阶段，缺少系统的、能坚持的理财引导。</w:t>
       </w:r>
+      <w:r>
+        <w:drawing>
+          <wp:inline distT="0" distB="0" distL="114300" distR="114300">
+            <wp:extent cx="5760085" cy="3073400"/>
+            <wp:effectExtent l="0" t="0" r="5715" b="0"/>
+            <wp:docPr id="1" name="图片 1"/>
+            <wp:cNvGraphicFramePr>
+              <a:graphicFrameLocks xmlns:a="http://schemas.openxmlformats.org/drawingml/2006/main" noChangeAspect="1"/>
+            </wp:cNvGraphicFramePr>
+            <a:graphic xmlns:a="http://schemas.openxmlformats.org/drawingml/2006/main">
+              <a:graphicData uri="http://schemas.openxmlformats.org/drawingml/2006/picture">
+                <pic:pic xmlns:pic="http://schemas.openxmlformats.org/drawingml/2006/picture">
+                  <pic:nvPicPr>
+                    <pic:cNvPr id="1" name="图片 1"/>
+                    <pic:cNvPicPr>
+                      <a:picLocks noChangeAspect="1"/>
+                    </pic:cNvPicPr>
+                  </pic:nvPicPr>
+                  <pic:blipFill>
+                    <a:blip r:embed="rId9"/>
+                    <a:stretch>
+                      <a:fillRect/>
+                    </a:stretch>
+                  </pic:blipFill>
+                  <pic:spPr>
+                    <a:xfrm>
+                      <a:off x="0" y="0"/>
+                      <a:ext cx="5760085" cy="3073400"/>
+                    </a:xfrm>
+                    <a:prstGeom prst="rect">
+                      <a:avLst/>
+                    </a:prstGeom>
+                    <a:noFill/>
+                    <a:ln>
+                      <a:noFill/>
+                    </a:ln>
+                  </pic:spPr>
+                </pic:pic>
+              </a:graphicData>
+            </a:graphic>
+          </wp:inline>
+        </w:drawing>
+      </w:r>
     </w:p>
     <w:p>
       <w:pPr>
@@ -3057,8 +3119,6 @@
         </w:rPr>
         <w:t>数据来源：《2024手机银行发展分析报告》（易观分析），2024年；中国工商银行官网《工商银行个人客户金融资产规模率先突破22万亿元》，2024年11月。</w:t>
       </w:r>
-      <w:bookmarkStart w:id="5" w:name="_GoBack"/>
-      <w:bookmarkEnd w:id="5"/>
     </w:p>
     <w:p>
       <w:pPr>
@@ -3122,721 +3182,6 @@
           <w:sz w:val="21"/>
         </w:rPr>
         <w:t>表1　竞品对标与差异化</w:t>
-      </w:r>
-    </w:p>
-    <w:tbl>
-      <w:tblPr>
-        <w:tblStyle w:val="35"/>
-        <w:tblW w:w="0" w:type="auto"/>
-        <w:jc w:val="center"/>
-        <w:tblBorders>
-          <w:top w:val="single" w:color="auto" w:sz="4" w:space="0"/>
-          <w:left w:val="single" w:color="auto" w:sz="4" w:space="0"/>
-          <w:bottom w:val="single" w:color="auto" w:sz="4" w:space="0"/>
-          <w:right w:val="single" w:color="auto" w:sz="4" w:space="0"/>
-          <w:insideH w:val="single" w:color="auto" w:sz="4" w:space="0"/>
-          <w:insideV w:val="single" w:color="auto" w:sz="4" w:space="0"/>
-        </w:tblBorders>
-        <w:tblLayout w:type="autofit"/>
-        <w:tblCellMar>
-          <w:top w:w="0" w:type="dxa"/>
-          <w:left w:w="108" w:type="dxa"/>
-          <w:bottom w:w="0" w:type="dxa"/>
-          <w:right w:w="108" w:type="dxa"/>
-        </w:tblCellMar>
-      </w:tblPr>
-      <w:tblGrid>
-        <w:gridCol w:w="2154"/>
-        <w:gridCol w:w="2381"/>
-        <w:gridCol w:w="2381"/>
-        <w:gridCol w:w="2154"/>
-      </w:tblGrid>
-      <w:tr>
-        <w:tblPrEx>
-          <w:tblBorders>
-            <w:top w:val="single" w:color="auto" w:sz="4" w:space="0"/>
-            <w:left w:val="single" w:color="auto" w:sz="4" w:space="0"/>
-            <w:bottom w:val="single" w:color="auto" w:sz="4" w:space="0"/>
-            <w:right w:val="single" w:color="auto" w:sz="4" w:space="0"/>
-            <w:insideH w:val="single" w:color="auto" w:sz="4" w:space="0"/>
-            <w:insideV w:val="single" w:color="auto" w:sz="4" w:space="0"/>
-          </w:tblBorders>
-        </w:tblPrEx>
-        <w:trPr>
-          <w:tblHeader/>
-          <w:jc w:val="center"/>
-        </w:trPr>
-        <w:tc>
-          <w:tcPr>
-            <w:tcW w:w="2154" w:type="dxa"/>
-            <w:shd w:val="clear" w:color="auto" w:fill="C7000B"/>
-            <w:vAlign w:val="center"/>
-          </w:tcPr>
-          <w:p>
-            <w:pPr>
-              <w:spacing w:before="40" w:after="40" w:line="240" w:lineRule="auto"/>
-              <w:ind w:firstLine="0"/>
-              <w:jc w:val="center"/>
-            </w:pPr>
-            <w:r>
-              <w:rPr>
-                <w:rFonts w:ascii="Times New Roman" w:hAnsi="Times New Roman" w:eastAsia="宋体"/>
-                <w:b/>
-                <w:color w:val="FFFFFF"/>
-                <w:sz w:val="21"/>
-              </w:rPr>
-              <w:t>对标产品</w:t>
-            </w:r>
-          </w:p>
-        </w:tc>
-        <w:tc>
-          <w:tcPr>
-            <w:tcW w:w="2381" w:type="dxa"/>
-            <w:shd w:val="clear" w:color="auto" w:fill="C7000B"/>
-            <w:vAlign w:val="center"/>
-          </w:tcPr>
-          <w:p>
-            <w:pPr>
-              <w:spacing w:before="40" w:after="40" w:line="240" w:lineRule="auto"/>
-              <w:ind w:firstLine="0"/>
-              <w:jc w:val="center"/>
-            </w:pPr>
-            <w:r>
-              <w:rPr>
-                <w:rFonts w:ascii="Times New Roman" w:hAnsi="Times New Roman" w:eastAsia="宋体"/>
-                <w:b/>
-                <w:color w:val="FFFFFF"/>
-                <w:sz w:val="21"/>
-              </w:rPr>
-              <w:t>可借鉴之处</w:t>
-            </w:r>
-          </w:p>
-        </w:tc>
-        <w:tc>
-          <w:tcPr>
-            <w:tcW w:w="2381" w:type="dxa"/>
-            <w:shd w:val="clear" w:color="auto" w:fill="C7000B"/>
-            <w:vAlign w:val="center"/>
-          </w:tcPr>
-          <w:p>
-            <w:pPr>
-              <w:spacing w:before="40" w:after="40" w:line="240" w:lineRule="auto"/>
-              <w:ind w:firstLine="0"/>
-              <w:jc w:val="center"/>
-            </w:pPr>
-            <w:r>
-              <w:rPr>
-                <w:rFonts w:ascii="Times New Roman" w:hAnsi="Times New Roman" w:eastAsia="宋体"/>
-                <w:b/>
-                <w:color w:val="FFFFFF"/>
-                <w:sz w:val="21"/>
-              </w:rPr>
-              <w:t>不足</w:t>
-            </w:r>
-          </w:p>
-        </w:tc>
-        <w:tc>
-          <w:tcPr>
-            <w:tcW w:w="2154" w:type="dxa"/>
-            <w:shd w:val="clear" w:color="auto" w:fill="C7000B"/>
-            <w:vAlign w:val="center"/>
-          </w:tcPr>
-          <w:p>
-            <w:pPr>
-              <w:spacing w:before="40" w:after="40" w:line="240" w:lineRule="auto"/>
-              <w:ind w:firstLine="0"/>
-              <w:jc w:val="center"/>
-            </w:pPr>
-            <w:r>
-              <w:rPr>
-                <w:rFonts w:ascii="Times New Roman" w:hAnsi="Times New Roman" w:eastAsia="宋体"/>
-                <w:b/>
-                <w:color w:val="FFFFFF"/>
-                <w:sz w:val="21"/>
-              </w:rPr>
-              <w:t>本项目差异</w:t>
-            </w:r>
-          </w:p>
-        </w:tc>
-      </w:tr>
-      <w:tr>
-        <w:tblPrEx>
-          <w:tblBorders>
-            <w:top w:val="single" w:color="auto" w:sz="4" w:space="0"/>
-            <w:left w:val="single" w:color="auto" w:sz="4" w:space="0"/>
-            <w:bottom w:val="single" w:color="auto" w:sz="4" w:space="0"/>
-            <w:right w:val="single" w:color="auto" w:sz="4" w:space="0"/>
-            <w:insideH w:val="single" w:color="auto" w:sz="4" w:space="0"/>
-            <w:insideV w:val="single" w:color="auto" w:sz="4" w:space="0"/>
-          </w:tblBorders>
-          <w:tblCellMar>
-            <w:top w:w="0" w:type="dxa"/>
-            <w:left w:w="108" w:type="dxa"/>
-            <w:bottom w:w="0" w:type="dxa"/>
-            <w:right w:w="108" w:type="dxa"/>
-          </w:tblCellMar>
-        </w:tblPrEx>
-        <w:trPr>
-          <w:cantSplit/>
-          <w:jc w:val="center"/>
-        </w:trPr>
-        <w:tc>
-          <w:tcPr>
-            <w:tcW w:w="2154" w:type="dxa"/>
-            <w:vAlign w:val="center"/>
-          </w:tcPr>
-          <w:p>
-            <w:pPr>
-              <w:spacing w:before="40" w:after="40" w:line="240" w:lineRule="auto"/>
-              <w:ind w:firstLine="0"/>
-              <w:jc w:val="center"/>
-            </w:pPr>
-            <w:r>
-              <w:rPr>
-                <w:rFonts w:ascii="Times New Roman" w:hAnsi="Times New Roman" w:eastAsia="宋体"/>
-                <w:b w:val="0"/>
-                <w:color w:val="000000"/>
-                <w:sz w:val="21"/>
-              </w:rPr>
-              <w:t>工行星青年Online（自营）</w:t>
-            </w:r>
-          </w:p>
-        </w:tc>
-        <w:tc>
-          <w:tcPr>
-            <w:tcW w:w="2381" w:type="dxa"/>
-            <w:vAlign w:val="center"/>
-          </w:tcPr>
-          <w:p>
-            <w:pPr>
-              <w:spacing w:before="40" w:after="40" w:line="240" w:lineRule="auto"/>
-              <w:ind w:firstLine="0"/>
-              <w:jc w:val="left"/>
-            </w:pPr>
-            <w:r>
-              <w:rPr>
-                <w:rFonts w:ascii="Times New Roman" w:hAnsi="Times New Roman" w:eastAsia="宋体"/>
-                <w:b w:val="0"/>
-                <w:color w:val="000000"/>
-                <w:sz w:val="21"/>
-              </w:rPr>
-              <w:t>角色身份、勋章成就、风险测评前置、i豆统一激励</w:t>
-            </w:r>
-          </w:p>
-        </w:tc>
-        <w:tc>
-          <w:tcPr>
-            <w:tcW w:w="2381" w:type="dxa"/>
-            <w:vAlign w:val="center"/>
-          </w:tcPr>
-          <w:p>
-            <w:pPr>
-              <w:spacing w:before="40" w:after="40" w:line="240" w:lineRule="auto"/>
-              <w:ind w:firstLine="0"/>
-              <w:jc w:val="left"/>
-            </w:pPr>
-            <w:r>
-              <w:rPr>
-                <w:rFonts w:ascii="Times New Roman" w:hAnsi="Times New Roman" w:eastAsia="宋体"/>
-                <w:b w:val="0"/>
-                <w:color w:val="000000"/>
-                <w:sz w:val="21"/>
-              </w:rPr>
-              <w:t>任务型：离散任务+即时奖励，做完即止，无周期、无剧情、无认知递进</w:t>
-            </w:r>
-          </w:p>
-        </w:tc>
-        <w:tc>
-          <w:tcPr>
-            <w:tcW w:w="2154" w:type="dxa"/>
-            <w:vAlign w:val="center"/>
-          </w:tcPr>
-          <w:p>
-            <w:pPr>
-              <w:spacing w:before="40" w:after="40" w:line="240" w:lineRule="auto"/>
-              <w:ind w:firstLine="0"/>
-              <w:jc w:val="left"/>
-            </w:pPr>
-            <w:r>
-              <w:rPr>
-                <w:rFonts w:ascii="Times New Roman" w:hAnsi="Times New Roman" w:eastAsia="宋体"/>
-                <w:b w:val="0"/>
-                <w:color w:val="000000"/>
-                <w:sz w:val="21"/>
-              </w:rPr>
-              <w:t>养成型：21天三幕剧情+目标可视化成长+熟人小队陪伴，习惯内化、留客转化</w:t>
-            </w:r>
-          </w:p>
-        </w:tc>
-      </w:tr>
-      <w:tr>
-        <w:tblPrEx>
-          <w:tblBorders>
-            <w:top w:val="single" w:color="auto" w:sz="4" w:space="0"/>
-            <w:left w:val="single" w:color="auto" w:sz="4" w:space="0"/>
-            <w:bottom w:val="single" w:color="auto" w:sz="4" w:space="0"/>
-            <w:right w:val="single" w:color="auto" w:sz="4" w:space="0"/>
-            <w:insideH w:val="single" w:color="auto" w:sz="4" w:space="0"/>
-            <w:insideV w:val="single" w:color="auto" w:sz="4" w:space="0"/>
-          </w:tblBorders>
-          <w:tblCellMar>
-            <w:top w:w="0" w:type="dxa"/>
-            <w:left w:w="108" w:type="dxa"/>
-            <w:bottom w:w="0" w:type="dxa"/>
-            <w:right w:w="108" w:type="dxa"/>
-          </w:tblCellMar>
-        </w:tblPrEx>
-        <w:trPr>
-          <w:cantSplit/>
-          <w:jc w:val="center"/>
-        </w:trPr>
-        <w:tc>
-          <w:tcPr>
-            <w:tcW w:w="2154" w:type="dxa"/>
-            <w:shd w:val="clear" w:color="auto" w:fill="FBF3E7"/>
-            <w:vAlign w:val="center"/>
-          </w:tcPr>
-          <w:p>
-            <w:pPr>
-              <w:spacing w:before="40" w:after="40" w:line="240" w:lineRule="auto"/>
-              <w:ind w:firstLine="0"/>
-              <w:jc w:val="center"/>
-            </w:pPr>
-            <w:r>
-              <w:rPr>
-                <w:rFonts w:ascii="Times New Roman" w:hAnsi="Times New Roman" w:eastAsia="宋体"/>
-                <w:b w:val="0"/>
-                <w:color w:val="000000"/>
-                <w:sz w:val="21"/>
-              </w:rPr>
-              <w:t>Toss“养成吧31天”存款</w:t>
-            </w:r>
-          </w:p>
-        </w:tc>
-        <w:tc>
-          <w:tcPr>
-            <w:tcW w:w="2381" w:type="dxa"/>
-            <w:shd w:val="clear" w:color="auto" w:fill="FBF3E7"/>
-            <w:vAlign w:val="center"/>
-          </w:tcPr>
-          <w:p>
-            <w:pPr>
-              <w:spacing w:before="40" w:after="40" w:line="240" w:lineRule="auto"/>
-              <w:ind w:firstLine="0"/>
-              <w:jc w:val="left"/>
-            </w:pPr>
-            <w:r>
-              <w:rPr>
-                <w:rFonts w:ascii="Times New Roman" w:hAnsi="Times New Roman" w:eastAsia="宋体"/>
-                <w:b w:val="0"/>
-                <w:color w:val="000000"/>
-                <w:sz w:val="21"/>
-              </w:rPr>
-              <w:t>养成系角色、每日任务、进度激励</w:t>
-            </w:r>
-          </w:p>
-        </w:tc>
-        <w:tc>
-          <w:tcPr>
-            <w:tcW w:w="2381" w:type="dxa"/>
-            <w:shd w:val="clear" w:color="auto" w:fill="FBF3E7"/>
-            <w:vAlign w:val="center"/>
-          </w:tcPr>
-          <w:p>
-            <w:pPr>
-              <w:spacing w:before="40" w:after="40" w:line="240" w:lineRule="auto"/>
-              <w:ind w:firstLine="0"/>
-              <w:jc w:val="left"/>
-            </w:pPr>
-            <w:r>
-              <w:rPr>
-                <w:rFonts w:ascii="Times New Roman" w:hAnsi="Times New Roman" w:eastAsia="宋体"/>
-                <w:b w:val="0"/>
-                <w:color w:val="000000"/>
-                <w:sz w:val="21"/>
-              </w:rPr>
-              <w:t>与存款利率强挂钩，国内不能照搬</w:t>
-            </w:r>
-          </w:p>
-        </w:tc>
-        <w:tc>
-          <w:tcPr>
-            <w:tcW w:w="2154" w:type="dxa"/>
-            <w:shd w:val="clear" w:color="auto" w:fill="FBF3E7"/>
-            <w:vAlign w:val="center"/>
-          </w:tcPr>
-          <w:p>
-            <w:pPr>
-              <w:spacing w:before="40" w:after="40" w:line="240" w:lineRule="auto"/>
-              <w:ind w:firstLine="0"/>
-              <w:jc w:val="left"/>
-            </w:pPr>
-            <w:r>
-              <w:rPr>
-                <w:rFonts w:ascii="Times New Roman" w:hAnsi="Times New Roman" w:eastAsia="宋体"/>
-                <w:b w:val="0"/>
-                <w:color w:val="000000"/>
-                <w:sz w:val="21"/>
-              </w:rPr>
-              <w:t>权益改为体验金/手续费优惠/卡面，不碰利率</w:t>
-            </w:r>
-          </w:p>
-        </w:tc>
-      </w:tr>
-      <w:tr>
-        <w:tblPrEx>
-          <w:tblBorders>
-            <w:top w:val="single" w:color="auto" w:sz="4" w:space="0"/>
-            <w:left w:val="single" w:color="auto" w:sz="4" w:space="0"/>
-            <w:bottom w:val="single" w:color="auto" w:sz="4" w:space="0"/>
-            <w:right w:val="single" w:color="auto" w:sz="4" w:space="0"/>
-            <w:insideH w:val="single" w:color="auto" w:sz="4" w:space="0"/>
-            <w:insideV w:val="single" w:color="auto" w:sz="4" w:space="0"/>
-          </w:tblBorders>
-          <w:tblCellMar>
-            <w:top w:w="0" w:type="dxa"/>
-            <w:left w:w="108" w:type="dxa"/>
-            <w:bottom w:w="0" w:type="dxa"/>
-            <w:right w:w="108" w:type="dxa"/>
-          </w:tblCellMar>
-        </w:tblPrEx>
-        <w:trPr>
-          <w:cantSplit/>
-          <w:jc w:val="center"/>
-        </w:trPr>
-        <w:tc>
-          <w:tcPr>
-            <w:tcW w:w="2154" w:type="dxa"/>
-            <w:vAlign w:val="center"/>
-          </w:tcPr>
-          <w:p>
-            <w:pPr>
-              <w:spacing w:before="40" w:after="40" w:line="240" w:lineRule="auto"/>
-              <w:ind w:firstLine="0"/>
-              <w:jc w:val="center"/>
-            </w:pPr>
-            <w:r>
-              <w:rPr>
-                <w:rFonts w:ascii="Times New Roman" w:hAnsi="Times New Roman" w:eastAsia="宋体"/>
-                <w:b w:val="0"/>
-                <w:color w:val="000000"/>
-                <w:sz w:val="21"/>
-              </w:rPr>
-              <w:t>Fidelity 10个存钱挑战</w:t>
-            </w:r>
-          </w:p>
-        </w:tc>
-        <w:tc>
-          <w:tcPr>
-            <w:tcW w:w="2381" w:type="dxa"/>
-            <w:vAlign w:val="center"/>
-          </w:tcPr>
-          <w:p>
-            <w:pPr>
-              <w:spacing w:before="40" w:after="40" w:line="240" w:lineRule="auto"/>
-              <w:ind w:firstLine="0"/>
-              <w:jc w:val="left"/>
-            </w:pPr>
-            <w:r>
-              <w:rPr>
-                <w:rFonts w:ascii="Times New Roman" w:hAnsi="Times New Roman" w:eastAsia="宋体"/>
-                <w:b w:val="0"/>
-                <w:color w:val="000000"/>
-                <w:sz w:val="21"/>
-              </w:rPr>
-              <w:t>盲盒、骰子、不消费等趣味存钱机制</w:t>
-            </w:r>
-          </w:p>
-        </w:tc>
-        <w:tc>
-          <w:tcPr>
-            <w:tcW w:w="2381" w:type="dxa"/>
-            <w:vAlign w:val="center"/>
-          </w:tcPr>
-          <w:p>
-            <w:pPr>
-              <w:spacing w:before="40" w:after="40" w:line="240" w:lineRule="auto"/>
-              <w:ind w:firstLine="0"/>
-              <w:jc w:val="center"/>
-            </w:pPr>
-            <w:r>
-              <w:rPr>
-                <w:rFonts w:ascii="Times New Roman" w:hAnsi="Times New Roman" w:eastAsia="宋体"/>
-                <w:b w:val="0"/>
-                <w:color w:val="000000"/>
-                <w:sz w:val="21"/>
-              </w:rPr>
-              <w:t>纯文字挑战、无情感剧情</w:t>
-            </w:r>
-          </w:p>
-        </w:tc>
-        <w:tc>
-          <w:tcPr>
-            <w:tcW w:w="2154" w:type="dxa"/>
-            <w:vAlign w:val="center"/>
-          </w:tcPr>
-          <w:p>
-            <w:pPr>
-              <w:spacing w:before="40" w:after="40" w:line="240" w:lineRule="auto"/>
-              <w:ind w:firstLine="0"/>
-              <w:jc w:val="left"/>
-            </w:pPr>
-            <w:r>
-              <w:rPr>
-                <w:rFonts w:ascii="Times New Roman" w:hAnsi="Times New Roman" w:eastAsia="宋体"/>
-                <w:b w:val="0"/>
-                <w:color w:val="000000"/>
-                <w:sz w:val="21"/>
-              </w:rPr>
-              <w:t>叠加五条人生剧情线，有情感钩子</w:t>
-            </w:r>
-          </w:p>
-        </w:tc>
-      </w:tr>
-      <w:tr>
-        <w:tblPrEx>
-          <w:tblBorders>
-            <w:top w:val="single" w:color="auto" w:sz="4" w:space="0"/>
-            <w:left w:val="single" w:color="auto" w:sz="4" w:space="0"/>
-            <w:bottom w:val="single" w:color="auto" w:sz="4" w:space="0"/>
-            <w:right w:val="single" w:color="auto" w:sz="4" w:space="0"/>
-            <w:insideH w:val="single" w:color="auto" w:sz="4" w:space="0"/>
-            <w:insideV w:val="single" w:color="auto" w:sz="4" w:space="0"/>
-          </w:tblBorders>
-          <w:tblCellMar>
-            <w:top w:w="0" w:type="dxa"/>
-            <w:left w:w="108" w:type="dxa"/>
-            <w:bottom w:w="0" w:type="dxa"/>
-            <w:right w:w="108" w:type="dxa"/>
-          </w:tblCellMar>
-        </w:tblPrEx>
-        <w:trPr>
-          <w:cantSplit/>
-          <w:jc w:val="center"/>
-        </w:trPr>
-        <w:tc>
-          <w:tcPr>
-            <w:tcW w:w="2154" w:type="dxa"/>
-            <w:shd w:val="clear" w:color="auto" w:fill="FBF3E7"/>
-            <w:vAlign w:val="center"/>
-          </w:tcPr>
-          <w:p>
-            <w:pPr>
-              <w:spacing w:before="40" w:after="40" w:line="240" w:lineRule="auto"/>
-              <w:ind w:firstLine="0"/>
-              <w:jc w:val="center"/>
-            </w:pPr>
-            <w:r>
-              <w:rPr>
-                <w:rFonts w:ascii="Times New Roman" w:hAnsi="Times New Roman" w:eastAsia="宋体"/>
-                <w:b w:val="0"/>
-                <w:color w:val="000000"/>
-                <w:sz w:val="21"/>
-              </w:rPr>
-              <w:t>互联网平台游戏化存钱</w:t>
-            </w:r>
-          </w:p>
-        </w:tc>
-        <w:tc>
-          <w:tcPr>
-            <w:tcW w:w="2381" w:type="dxa"/>
-            <w:shd w:val="clear" w:color="auto" w:fill="FBF3E7"/>
-            <w:vAlign w:val="center"/>
-          </w:tcPr>
-          <w:p>
-            <w:pPr>
-              <w:spacing w:before="40" w:after="40" w:line="240" w:lineRule="auto"/>
-              <w:ind w:firstLine="0"/>
-              <w:jc w:val="center"/>
-            </w:pPr>
-            <w:r>
-              <w:rPr>
-                <w:rFonts w:ascii="Times New Roman" w:hAnsi="Times New Roman" w:eastAsia="宋体"/>
-                <w:b w:val="0"/>
-                <w:color w:val="000000"/>
-                <w:sz w:val="21"/>
-              </w:rPr>
-              <w:t>玩法成熟、用户量大</w:t>
-            </w:r>
-          </w:p>
-        </w:tc>
-        <w:tc>
-          <w:tcPr>
-            <w:tcW w:w="2381" w:type="dxa"/>
-            <w:shd w:val="clear" w:color="auto" w:fill="FBF3E7"/>
-            <w:vAlign w:val="center"/>
-          </w:tcPr>
-          <w:p>
-            <w:pPr>
-              <w:spacing w:before="40" w:after="40" w:line="240" w:lineRule="auto"/>
-              <w:ind w:firstLine="0"/>
-              <w:jc w:val="left"/>
-            </w:pPr>
-            <w:r>
-              <w:rPr>
-                <w:rFonts w:ascii="Times New Roman" w:hAnsi="Times New Roman" w:eastAsia="宋体"/>
-                <w:b w:val="0"/>
-                <w:color w:val="000000"/>
-                <w:sz w:val="21"/>
-              </w:rPr>
-              <w:t>钱不在银行、不导真金融决策</w:t>
-            </w:r>
-          </w:p>
-        </w:tc>
-        <w:tc>
-          <w:tcPr>
-            <w:tcW w:w="2154" w:type="dxa"/>
-            <w:shd w:val="clear" w:color="auto" w:fill="FBF3E7"/>
-            <w:vAlign w:val="center"/>
-          </w:tcPr>
-          <w:p>
-            <w:pPr>
-              <w:spacing w:before="40" w:after="40" w:line="240" w:lineRule="auto"/>
-              <w:ind w:firstLine="0"/>
-              <w:jc w:val="left"/>
-            </w:pPr>
-            <w:r>
-              <w:rPr>
-                <w:rFonts w:ascii="Times New Roman" w:hAnsi="Times New Roman" w:eastAsia="宋体"/>
-                <w:b w:val="0"/>
-                <w:color w:val="000000"/>
-                <w:sz w:val="21"/>
-              </w:rPr>
-              <w:t>钱留在工行真账户，跳转走风险测评</w:t>
-            </w:r>
-          </w:p>
-        </w:tc>
-      </w:tr>
-    </w:tbl>
-    <w:p>
-      <w:pPr>
-        <w:spacing w:before="0" w:after="120" w:line="360" w:lineRule="auto"/>
-      </w:pPr>
-      <w:r>
-        <w:rPr>
-          <w:rFonts w:ascii="Times New Roman" w:hAnsi="Times New Roman" w:eastAsia="宋体"/>
-          <w:b w:val="0"/>
-          <w:color w:val="5A5A5A"/>
-          <w:sz w:val="21"/>
-        </w:rPr>
-        <w:t>案例来源：星青年Online见工行手机银行星青年专区（m.icbc.com.cn年轻新客专区）；Toss养成系存款见 Asia Business 2026年8月报道；Fidelity存钱挑战见 Fidelity Learning Center。</w:t>
-      </w:r>
-    </w:p>
-    <w:p>
-      <w:pPr>
-        <w:spacing w:before="0" w:after="0" w:line="360" w:lineRule="auto"/>
-        <w:ind w:firstLine="480"/>
-      </w:pPr>
-      <w:r>
-        <w:rPr>
-          <w:rFonts w:ascii="Times New Roman" w:hAnsi="Times New Roman" w:eastAsia="宋体"/>
-          <w:b w:val="0"/>
-          <w:color w:val="000000"/>
-          <w:sz w:val="24"/>
-        </w:rPr>
-        <w:t>在所有对标对象中，工行手机银行自有的“星青年Online”年轻新客专区与本项目表面相似度最高，但两者属于两种产品范式，这也是本项目区别于星青年的根本所在。星青年Online是任务型（Task-based）获客产品：以“新客见面礼—开卡—绑卡—首消—邀请”等离散任务和工银i豆即时奖励，驱动用户完成一次性开户与首用行为，用户是“领取任务的玩家”，每条角色线仅两三个步骤、做完即止，无连续周期、无剧情、无认知递进，任务完成即关系结束，留存依赖运营不断上新任务。21天财富剧本是养成型（Growth-based）留客产品：以连续21天的三幕式剧情（觉醒—积累—守护）、目标可视化成长（小家从毛坯到温馨、旅行地图逐点点亮）和熟人小队陪伴，驱动用户完成“攒钱习惯养成—理财认知升级—投资行为转化”的完整闭环，用户是“陪伴目标成长的主角”，每天推进的不是任务清单而是自己的人生故事，21天毕业不是关系终点而是理财人生的起点，用户与工行之间沉淀的是情感账户而非一次性交易。一句话概括：星青年Online解决“让年轻人走进工行”，本项目解决“让走进工行的年轻人留下来理财”——前者是获客入口，后者是留客养成引擎，两者在用户旅程上形成接力，而非竞争。</w:t>
-      </w:r>
-    </w:p>
-    <w:p>
-      <w:pPr>
-        <w:pStyle w:val="4"/>
-        <w:keepNext/>
-        <w:pBdr>
-          <w:left w:val="single" w:color="FFC93C" w:sz="18" w:space="4"/>
-        </w:pBdr>
-        <w:spacing w:before="220" w:after="100"/>
-      </w:pPr>
-      <w:r>
-        <w:rPr>
-          <w:rFonts w:ascii="Times New Roman" w:hAnsi="Times New Roman" w:eastAsia="黑体"/>
-          <w:b/>
-          <w:color w:val="1E2A4A"/>
-          <w:sz w:val="28"/>
-        </w:rPr>
-        <w:t>2.4 用户分析</w:t>
-      </w:r>
-    </w:p>
-    <w:p>
-      <w:pPr>
-        <w:spacing w:before="0" w:after="0" w:line="360" w:lineRule="auto"/>
-        <w:ind w:firstLine="480"/>
-      </w:pPr>
-      <w:r>
-        <w:rPr>
-          <w:rFonts w:ascii="Times New Roman" w:hAnsi="Times New Roman" w:eastAsia="宋体"/>
-          <w:b w:val="0"/>
-          <w:color w:val="000000"/>
-          <w:sz w:val="24"/>
-        </w:rPr>
-        <w:t>为避免“自嗨式”设计，团队在2026年8至9月围绕“年轻人的理财意愿、现实障碍与陪伴式产品偏好”开展了一手调研。调研采用线上与线下相结合的方式：线上通过高校社群和社交平台发放电子问卷，线下在高校校园</w:t>
-      </w:r>
-      <w:r>
-        <w:rPr>
-          <w:rFonts w:hint="eastAsia" w:ascii="Times New Roman" w:hAnsi="Times New Roman" w:eastAsia="宋体"/>
-          <w:b w:val="0"/>
-          <w:color w:val="000000"/>
-          <w:sz w:val="24"/>
-          <w:lang w:val="en-US" w:eastAsia="zh-CN"/>
-        </w:rPr>
-        <w:t>与</w:t>
-      </w:r>
-      <w:r>
-        <w:rPr>
-          <w:rFonts w:ascii="Times New Roman" w:hAnsi="Times New Roman" w:eastAsia="宋体"/>
-          <w:b w:val="0"/>
-          <w:color w:val="000000"/>
-          <w:sz w:val="24"/>
-        </w:rPr>
-        <w:t>青年聚集商圈</w:t>
-      </w:r>
-      <w:r>
-        <w:rPr>
-          <w:rFonts w:hint="eastAsia" w:ascii="Times New Roman" w:hAnsi="Times New Roman" w:eastAsia="宋体"/>
-          <w:b w:val="0"/>
-          <w:color w:val="000000"/>
-          <w:sz w:val="24"/>
-          <w:lang w:val="en-US" w:eastAsia="zh-CN"/>
-        </w:rPr>
-        <w:t>发放</w:t>
-      </w:r>
-      <w:r>
-        <w:rPr>
-          <w:rFonts w:ascii="Times New Roman" w:hAnsi="Times New Roman" w:eastAsia="宋体"/>
-          <w:b w:val="0"/>
-          <w:color w:val="000000"/>
-          <w:sz w:val="24"/>
-        </w:rPr>
-        <w:t>；共发放问卷400份，回收392份，剔除作答时间过短、前后逻辑矛盾的问卷16份，得到有效问卷376份，问卷有效回收率为94.0%。</w:t>
-      </w:r>
-    </w:p>
-    <w:p>
-      <w:pPr>
-        <w:spacing w:before="0" w:after="0" w:line="360" w:lineRule="auto"/>
-        <w:ind w:firstLine="480"/>
-      </w:pPr>
-      <w:r>
-        <w:rPr>
-          <w:rFonts w:ascii="Times New Roman" w:hAnsi="Times New Roman" w:eastAsia="宋体"/>
-          <w:b w:val="0"/>
-          <w:color w:val="000000"/>
-          <w:sz w:val="24"/>
-        </w:rPr>
-        <w:t>在问卷调查基础上，团队从三类目标人群中各选取4名、共12名典型用户，进行了30至45分钟的半结构化深度访谈，重点了解其存钱经历、放弃原因与对游戏化理财的真实顾虑。</w:t>
-      </w:r>
-    </w:p>
-    <w:p>
-      <w:pPr>
-        <w:spacing w:before="0" w:after="80" w:line="360" w:lineRule="auto"/>
-        <w:jc w:val="center"/>
-      </w:pPr>
-      <w:r>
-        <w:rPr>
-          <w:rFonts w:ascii="Times New Roman" w:hAnsi="Times New Roman" w:eastAsia="宋体"/>
-          <w:b w:val="0"/>
-          <w:color w:val="000000"/>
-          <w:sz w:val="21"/>
-        </w:rPr>
-        <w:t>表2　问卷样本结构（N=376）</w:t>
       </w:r>
     </w:p>
     <w:tbl>
@@ -3906,6 +3251,775 @@
                 <w:color w:val="FFFFFF"/>
                 <w:sz w:val="21"/>
               </w:rPr>
+              <w:t>对标产品</w:t>
+            </w:r>
+          </w:p>
+        </w:tc>
+        <w:tc>
+          <w:tcPr>
+            <w:tcW w:w="2381" w:type="dxa"/>
+            <w:shd w:val="clear" w:color="auto" w:fill="C7000B"/>
+            <w:vAlign w:val="center"/>
+          </w:tcPr>
+          <w:p>
+            <w:pPr>
+              <w:spacing w:before="40" w:after="40" w:line="240" w:lineRule="auto"/>
+              <w:ind w:firstLine="0"/>
+              <w:jc w:val="center"/>
+            </w:pPr>
+            <w:r>
+              <w:rPr>
+                <w:rFonts w:ascii="Times New Roman" w:hAnsi="Times New Roman" w:eastAsia="宋体"/>
+                <w:b/>
+                <w:color w:val="FFFFFF"/>
+                <w:sz w:val="21"/>
+              </w:rPr>
+              <w:t>可借鉴之处</w:t>
+            </w:r>
+          </w:p>
+        </w:tc>
+        <w:tc>
+          <w:tcPr>
+            <w:tcW w:w="2381" w:type="dxa"/>
+            <w:shd w:val="clear" w:color="auto" w:fill="C7000B"/>
+            <w:vAlign w:val="center"/>
+          </w:tcPr>
+          <w:p>
+            <w:pPr>
+              <w:spacing w:before="40" w:after="40" w:line="240" w:lineRule="auto"/>
+              <w:ind w:firstLine="0"/>
+              <w:jc w:val="center"/>
+            </w:pPr>
+            <w:r>
+              <w:rPr>
+                <w:rFonts w:ascii="Times New Roman" w:hAnsi="Times New Roman" w:eastAsia="宋体"/>
+                <w:b/>
+                <w:color w:val="FFFFFF"/>
+                <w:sz w:val="21"/>
+              </w:rPr>
+              <w:t>不足</w:t>
+            </w:r>
+          </w:p>
+        </w:tc>
+        <w:tc>
+          <w:tcPr>
+            <w:tcW w:w="2154" w:type="dxa"/>
+            <w:shd w:val="clear" w:color="auto" w:fill="C7000B"/>
+            <w:vAlign w:val="center"/>
+          </w:tcPr>
+          <w:p>
+            <w:pPr>
+              <w:spacing w:before="40" w:after="40" w:line="240" w:lineRule="auto"/>
+              <w:ind w:firstLine="0"/>
+              <w:jc w:val="center"/>
+            </w:pPr>
+            <w:r>
+              <w:rPr>
+                <w:rFonts w:ascii="Times New Roman" w:hAnsi="Times New Roman" w:eastAsia="宋体"/>
+                <w:b/>
+                <w:color w:val="FFFFFF"/>
+                <w:sz w:val="21"/>
+              </w:rPr>
+              <w:t>本项目差异</w:t>
+            </w:r>
+          </w:p>
+        </w:tc>
+      </w:tr>
+      <w:tr>
+        <w:tblPrEx>
+          <w:tblBorders>
+            <w:top w:val="single" w:color="auto" w:sz="4" w:space="0"/>
+            <w:left w:val="single" w:color="auto" w:sz="4" w:space="0"/>
+            <w:bottom w:val="single" w:color="auto" w:sz="4" w:space="0"/>
+            <w:right w:val="single" w:color="auto" w:sz="4" w:space="0"/>
+            <w:insideH w:val="single" w:color="auto" w:sz="4" w:space="0"/>
+            <w:insideV w:val="single" w:color="auto" w:sz="4" w:space="0"/>
+          </w:tblBorders>
+          <w:tblCellMar>
+            <w:top w:w="0" w:type="dxa"/>
+            <w:left w:w="108" w:type="dxa"/>
+            <w:bottom w:w="0" w:type="dxa"/>
+            <w:right w:w="108" w:type="dxa"/>
+          </w:tblCellMar>
+        </w:tblPrEx>
+        <w:trPr>
+          <w:cantSplit/>
+          <w:jc w:val="center"/>
+        </w:trPr>
+        <w:tc>
+          <w:tcPr>
+            <w:tcW w:w="2154" w:type="dxa"/>
+            <w:vAlign w:val="center"/>
+          </w:tcPr>
+          <w:p>
+            <w:pPr>
+              <w:spacing w:before="40" w:after="40" w:line="240" w:lineRule="auto"/>
+              <w:ind w:firstLine="0"/>
+              <w:jc w:val="center"/>
+            </w:pPr>
+            <w:r>
+              <w:rPr>
+                <w:rFonts w:ascii="Times New Roman" w:hAnsi="Times New Roman" w:eastAsia="宋体"/>
+                <w:b w:val="0"/>
+                <w:color w:val="000000"/>
+                <w:sz w:val="21"/>
+              </w:rPr>
+              <w:t>工行星青年Online（自营）</w:t>
+            </w:r>
+          </w:p>
+        </w:tc>
+        <w:tc>
+          <w:tcPr>
+            <w:tcW w:w="2381" w:type="dxa"/>
+            <w:vAlign w:val="center"/>
+          </w:tcPr>
+          <w:p>
+            <w:pPr>
+              <w:spacing w:before="40" w:after="40" w:line="240" w:lineRule="auto"/>
+              <w:ind w:firstLine="0"/>
+              <w:jc w:val="left"/>
+            </w:pPr>
+            <w:r>
+              <w:rPr>
+                <w:rFonts w:ascii="Times New Roman" w:hAnsi="Times New Roman" w:eastAsia="宋体"/>
+                <w:b w:val="0"/>
+                <w:color w:val="000000"/>
+                <w:sz w:val="21"/>
+              </w:rPr>
+              <w:t>角色身份、勋章成就、风险测评前置、i豆统一激励</w:t>
+            </w:r>
+          </w:p>
+        </w:tc>
+        <w:tc>
+          <w:tcPr>
+            <w:tcW w:w="2381" w:type="dxa"/>
+            <w:vAlign w:val="center"/>
+          </w:tcPr>
+          <w:p>
+            <w:pPr>
+              <w:spacing w:before="40" w:after="40" w:line="240" w:lineRule="auto"/>
+              <w:ind w:firstLine="0"/>
+              <w:jc w:val="left"/>
+            </w:pPr>
+            <w:r>
+              <w:rPr>
+                <w:rFonts w:ascii="Times New Roman" w:hAnsi="Times New Roman" w:eastAsia="宋体"/>
+                <w:b w:val="0"/>
+                <w:color w:val="000000"/>
+                <w:sz w:val="21"/>
+              </w:rPr>
+              <w:t>任务型：离散任务+即时奖励，做完即止，无周期、无剧情、无认知递进</w:t>
+            </w:r>
+          </w:p>
+        </w:tc>
+        <w:tc>
+          <w:tcPr>
+            <w:tcW w:w="2154" w:type="dxa"/>
+            <w:vAlign w:val="center"/>
+          </w:tcPr>
+          <w:p>
+            <w:pPr>
+              <w:spacing w:before="40" w:after="40" w:line="240" w:lineRule="auto"/>
+              <w:ind w:firstLine="0"/>
+              <w:jc w:val="left"/>
+            </w:pPr>
+            <w:r>
+              <w:rPr>
+                <w:rFonts w:ascii="Times New Roman" w:hAnsi="Times New Roman" w:eastAsia="宋体"/>
+                <w:b w:val="0"/>
+                <w:color w:val="000000"/>
+                <w:sz w:val="21"/>
+              </w:rPr>
+              <w:t>养成型：21天三幕剧情+目标可视化成长+熟人小队陪伴，习惯内化、留客转化</w:t>
+            </w:r>
+          </w:p>
+        </w:tc>
+      </w:tr>
+      <w:tr>
+        <w:tblPrEx>
+          <w:tblBorders>
+            <w:top w:val="single" w:color="auto" w:sz="4" w:space="0"/>
+            <w:left w:val="single" w:color="auto" w:sz="4" w:space="0"/>
+            <w:bottom w:val="single" w:color="auto" w:sz="4" w:space="0"/>
+            <w:right w:val="single" w:color="auto" w:sz="4" w:space="0"/>
+            <w:insideH w:val="single" w:color="auto" w:sz="4" w:space="0"/>
+            <w:insideV w:val="single" w:color="auto" w:sz="4" w:space="0"/>
+          </w:tblBorders>
+          <w:tblCellMar>
+            <w:top w:w="0" w:type="dxa"/>
+            <w:left w:w="108" w:type="dxa"/>
+            <w:bottom w:w="0" w:type="dxa"/>
+            <w:right w:w="108" w:type="dxa"/>
+          </w:tblCellMar>
+        </w:tblPrEx>
+        <w:trPr>
+          <w:cantSplit/>
+          <w:jc w:val="center"/>
+        </w:trPr>
+        <w:tc>
+          <w:tcPr>
+            <w:tcW w:w="2154" w:type="dxa"/>
+            <w:shd w:val="clear" w:color="auto" w:fill="FBF3E7"/>
+            <w:vAlign w:val="center"/>
+          </w:tcPr>
+          <w:p>
+            <w:pPr>
+              <w:spacing w:before="40" w:after="40" w:line="240" w:lineRule="auto"/>
+              <w:ind w:firstLine="0"/>
+              <w:jc w:val="center"/>
+            </w:pPr>
+            <w:r>
+              <w:rPr>
+                <w:rFonts w:ascii="Times New Roman" w:hAnsi="Times New Roman" w:eastAsia="宋体"/>
+                <w:b w:val="0"/>
+                <w:color w:val="000000"/>
+                <w:sz w:val="21"/>
+              </w:rPr>
+              <w:t>Toss“养成吧31天”存款</w:t>
+            </w:r>
+          </w:p>
+        </w:tc>
+        <w:tc>
+          <w:tcPr>
+            <w:tcW w:w="2381" w:type="dxa"/>
+            <w:shd w:val="clear" w:color="auto" w:fill="FBF3E7"/>
+            <w:vAlign w:val="center"/>
+          </w:tcPr>
+          <w:p>
+            <w:pPr>
+              <w:spacing w:before="40" w:after="40" w:line="240" w:lineRule="auto"/>
+              <w:ind w:firstLine="0"/>
+              <w:jc w:val="left"/>
+            </w:pPr>
+            <w:r>
+              <w:rPr>
+                <w:rFonts w:ascii="Times New Roman" w:hAnsi="Times New Roman" w:eastAsia="宋体"/>
+                <w:b w:val="0"/>
+                <w:color w:val="000000"/>
+                <w:sz w:val="21"/>
+              </w:rPr>
+              <w:t>养成系角色、每日任务、进度激励</w:t>
+            </w:r>
+          </w:p>
+        </w:tc>
+        <w:tc>
+          <w:tcPr>
+            <w:tcW w:w="2381" w:type="dxa"/>
+            <w:shd w:val="clear" w:color="auto" w:fill="FBF3E7"/>
+            <w:vAlign w:val="center"/>
+          </w:tcPr>
+          <w:p>
+            <w:pPr>
+              <w:spacing w:before="40" w:after="40" w:line="240" w:lineRule="auto"/>
+              <w:ind w:firstLine="0"/>
+              <w:jc w:val="left"/>
+            </w:pPr>
+            <w:r>
+              <w:rPr>
+                <w:rFonts w:ascii="Times New Roman" w:hAnsi="Times New Roman" w:eastAsia="宋体"/>
+                <w:b w:val="0"/>
+                <w:color w:val="000000"/>
+                <w:sz w:val="21"/>
+              </w:rPr>
+              <w:t>与存款利率强挂钩，国内不能照搬</w:t>
+            </w:r>
+          </w:p>
+        </w:tc>
+        <w:tc>
+          <w:tcPr>
+            <w:tcW w:w="2154" w:type="dxa"/>
+            <w:shd w:val="clear" w:color="auto" w:fill="FBF3E7"/>
+            <w:vAlign w:val="center"/>
+          </w:tcPr>
+          <w:p>
+            <w:pPr>
+              <w:spacing w:before="40" w:after="40" w:line="240" w:lineRule="auto"/>
+              <w:ind w:firstLine="0"/>
+              <w:jc w:val="left"/>
+            </w:pPr>
+            <w:r>
+              <w:rPr>
+                <w:rFonts w:ascii="Times New Roman" w:hAnsi="Times New Roman" w:eastAsia="宋体"/>
+                <w:b w:val="0"/>
+                <w:color w:val="000000"/>
+                <w:sz w:val="21"/>
+              </w:rPr>
+              <w:t>权益改为体验金/手续费优惠/卡面，不碰利率</w:t>
+            </w:r>
+          </w:p>
+        </w:tc>
+      </w:tr>
+      <w:tr>
+        <w:tblPrEx>
+          <w:tblBorders>
+            <w:top w:val="single" w:color="auto" w:sz="4" w:space="0"/>
+            <w:left w:val="single" w:color="auto" w:sz="4" w:space="0"/>
+            <w:bottom w:val="single" w:color="auto" w:sz="4" w:space="0"/>
+            <w:right w:val="single" w:color="auto" w:sz="4" w:space="0"/>
+            <w:insideH w:val="single" w:color="auto" w:sz="4" w:space="0"/>
+            <w:insideV w:val="single" w:color="auto" w:sz="4" w:space="0"/>
+          </w:tblBorders>
+          <w:tblCellMar>
+            <w:top w:w="0" w:type="dxa"/>
+            <w:left w:w="108" w:type="dxa"/>
+            <w:bottom w:w="0" w:type="dxa"/>
+            <w:right w:w="108" w:type="dxa"/>
+          </w:tblCellMar>
+        </w:tblPrEx>
+        <w:trPr>
+          <w:cantSplit/>
+          <w:jc w:val="center"/>
+        </w:trPr>
+        <w:tc>
+          <w:tcPr>
+            <w:tcW w:w="2154" w:type="dxa"/>
+            <w:vAlign w:val="center"/>
+          </w:tcPr>
+          <w:p>
+            <w:pPr>
+              <w:spacing w:before="40" w:after="40" w:line="240" w:lineRule="auto"/>
+              <w:ind w:firstLine="0"/>
+              <w:jc w:val="center"/>
+            </w:pPr>
+            <w:r>
+              <w:rPr>
+                <w:rFonts w:ascii="Times New Roman" w:hAnsi="Times New Roman" w:eastAsia="宋体"/>
+                <w:b w:val="0"/>
+                <w:color w:val="000000"/>
+                <w:sz w:val="21"/>
+              </w:rPr>
+              <w:t>Fidelity 10个存钱挑战</w:t>
+            </w:r>
+          </w:p>
+        </w:tc>
+        <w:tc>
+          <w:tcPr>
+            <w:tcW w:w="2381" w:type="dxa"/>
+            <w:vAlign w:val="center"/>
+          </w:tcPr>
+          <w:p>
+            <w:pPr>
+              <w:spacing w:before="40" w:after="40" w:line="240" w:lineRule="auto"/>
+              <w:ind w:firstLine="0"/>
+              <w:jc w:val="left"/>
+            </w:pPr>
+            <w:r>
+              <w:rPr>
+                <w:rFonts w:ascii="Times New Roman" w:hAnsi="Times New Roman" w:eastAsia="宋体"/>
+                <w:b w:val="0"/>
+                <w:color w:val="000000"/>
+                <w:sz w:val="21"/>
+              </w:rPr>
+              <w:t>盲盒、骰子、不消费等趣味存钱机制</w:t>
+            </w:r>
+          </w:p>
+        </w:tc>
+        <w:tc>
+          <w:tcPr>
+            <w:tcW w:w="2381" w:type="dxa"/>
+            <w:vAlign w:val="center"/>
+          </w:tcPr>
+          <w:p>
+            <w:pPr>
+              <w:spacing w:before="40" w:after="40" w:line="240" w:lineRule="auto"/>
+              <w:ind w:firstLine="0"/>
+              <w:jc w:val="center"/>
+            </w:pPr>
+            <w:r>
+              <w:rPr>
+                <w:rFonts w:ascii="Times New Roman" w:hAnsi="Times New Roman" w:eastAsia="宋体"/>
+                <w:b w:val="0"/>
+                <w:color w:val="000000"/>
+                <w:sz w:val="21"/>
+              </w:rPr>
+              <w:t>纯文字挑战、无情感剧情</w:t>
+            </w:r>
+          </w:p>
+        </w:tc>
+        <w:tc>
+          <w:tcPr>
+            <w:tcW w:w="2154" w:type="dxa"/>
+            <w:vAlign w:val="center"/>
+          </w:tcPr>
+          <w:p>
+            <w:pPr>
+              <w:spacing w:before="40" w:after="40" w:line="240" w:lineRule="auto"/>
+              <w:ind w:firstLine="0"/>
+              <w:jc w:val="left"/>
+            </w:pPr>
+            <w:r>
+              <w:rPr>
+                <w:rFonts w:ascii="Times New Roman" w:hAnsi="Times New Roman" w:eastAsia="宋体"/>
+                <w:b w:val="0"/>
+                <w:color w:val="000000"/>
+                <w:sz w:val="21"/>
+              </w:rPr>
+              <w:t>叠加五条人生剧情线，有情感钩子</w:t>
+            </w:r>
+          </w:p>
+        </w:tc>
+      </w:tr>
+      <w:tr>
+        <w:tblPrEx>
+          <w:tblBorders>
+            <w:top w:val="single" w:color="auto" w:sz="4" w:space="0"/>
+            <w:left w:val="single" w:color="auto" w:sz="4" w:space="0"/>
+            <w:bottom w:val="single" w:color="auto" w:sz="4" w:space="0"/>
+            <w:right w:val="single" w:color="auto" w:sz="4" w:space="0"/>
+            <w:insideH w:val="single" w:color="auto" w:sz="4" w:space="0"/>
+            <w:insideV w:val="single" w:color="auto" w:sz="4" w:space="0"/>
+          </w:tblBorders>
+          <w:tblCellMar>
+            <w:top w:w="0" w:type="dxa"/>
+            <w:left w:w="108" w:type="dxa"/>
+            <w:bottom w:w="0" w:type="dxa"/>
+            <w:right w:w="108" w:type="dxa"/>
+          </w:tblCellMar>
+        </w:tblPrEx>
+        <w:trPr>
+          <w:cantSplit/>
+          <w:jc w:val="center"/>
+        </w:trPr>
+        <w:tc>
+          <w:tcPr>
+            <w:tcW w:w="2154" w:type="dxa"/>
+            <w:shd w:val="clear" w:color="auto" w:fill="FBF3E7"/>
+            <w:vAlign w:val="center"/>
+          </w:tcPr>
+          <w:p>
+            <w:pPr>
+              <w:spacing w:before="40" w:after="40" w:line="240" w:lineRule="auto"/>
+              <w:ind w:firstLine="0"/>
+              <w:jc w:val="center"/>
+            </w:pPr>
+            <w:r>
+              <w:rPr>
+                <w:rFonts w:ascii="Times New Roman" w:hAnsi="Times New Roman" w:eastAsia="宋体"/>
+                <w:b w:val="0"/>
+                <w:color w:val="000000"/>
+                <w:sz w:val="21"/>
+              </w:rPr>
+              <w:t>互联网平台游戏化存钱</w:t>
+            </w:r>
+          </w:p>
+        </w:tc>
+        <w:tc>
+          <w:tcPr>
+            <w:tcW w:w="2381" w:type="dxa"/>
+            <w:shd w:val="clear" w:color="auto" w:fill="FBF3E7"/>
+            <w:vAlign w:val="center"/>
+          </w:tcPr>
+          <w:p>
+            <w:pPr>
+              <w:spacing w:before="40" w:after="40" w:line="240" w:lineRule="auto"/>
+              <w:ind w:firstLine="0"/>
+              <w:jc w:val="center"/>
+            </w:pPr>
+            <w:r>
+              <w:rPr>
+                <w:rFonts w:ascii="Times New Roman" w:hAnsi="Times New Roman" w:eastAsia="宋体"/>
+                <w:b w:val="0"/>
+                <w:color w:val="000000"/>
+                <w:sz w:val="21"/>
+              </w:rPr>
+              <w:t>玩法成熟、用户量大</w:t>
+            </w:r>
+          </w:p>
+        </w:tc>
+        <w:tc>
+          <w:tcPr>
+            <w:tcW w:w="2381" w:type="dxa"/>
+            <w:shd w:val="clear" w:color="auto" w:fill="FBF3E7"/>
+            <w:vAlign w:val="center"/>
+          </w:tcPr>
+          <w:p>
+            <w:pPr>
+              <w:spacing w:before="40" w:after="40" w:line="240" w:lineRule="auto"/>
+              <w:ind w:firstLine="0"/>
+              <w:jc w:val="left"/>
+            </w:pPr>
+            <w:r>
+              <w:rPr>
+                <w:rFonts w:ascii="Times New Roman" w:hAnsi="Times New Roman" w:eastAsia="宋体"/>
+                <w:b w:val="0"/>
+                <w:color w:val="000000"/>
+                <w:sz w:val="21"/>
+              </w:rPr>
+              <w:t>钱不在银行、不导真金融决策</w:t>
+            </w:r>
+          </w:p>
+        </w:tc>
+        <w:tc>
+          <w:tcPr>
+            <w:tcW w:w="2154" w:type="dxa"/>
+            <w:shd w:val="clear" w:color="auto" w:fill="FBF3E7"/>
+            <w:vAlign w:val="center"/>
+          </w:tcPr>
+          <w:p>
+            <w:pPr>
+              <w:spacing w:before="40" w:after="40" w:line="240" w:lineRule="auto"/>
+              <w:ind w:firstLine="0"/>
+              <w:jc w:val="left"/>
+            </w:pPr>
+            <w:r>
+              <w:rPr>
+                <w:rFonts w:ascii="Times New Roman" w:hAnsi="Times New Roman" w:eastAsia="宋体"/>
+                <w:b w:val="0"/>
+                <w:color w:val="000000"/>
+                <w:sz w:val="21"/>
+              </w:rPr>
+              <w:t>钱留在工行真账户，跳转走风险测评</w:t>
+            </w:r>
+          </w:p>
+        </w:tc>
+      </w:tr>
+    </w:tbl>
+    <w:p>
+      <w:pPr>
+        <w:spacing w:before="0" w:after="120" w:line="360" w:lineRule="auto"/>
+      </w:pPr>
+      <w:r>
+        <w:rPr>
+          <w:rFonts w:ascii="Times New Roman" w:hAnsi="Times New Roman" w:eastAsia="宋体"/>
+          <w:b w:val="0"/>
+          <w:color w:val="5A5A5A"/>
+          <w:sz w:val="21"/>
+        </w:rPr>
+        <w:t>案例来源：星青年Online见工行手机银行星青年专区（m.icbc.com.cn年轻新客专区）；Toss养成系存款见 Asia Business 2026年8月报道；Fidelity存钱挑战见 Fidelity Learning Center。</w:t>
+      </w:r>
+    </w:p>
+    <w:p>
+      <w:pPr>
+        <w:spacing w:before="0" w:after="0" w:line="360" w:lineRule="auto"/>
+        <w:ind w:firstLine="480"/>
+      </w:pPr>
+      <w:r>
+        <w:rPr>
+          <w:rFonts w:ascii="Times New Roman" w:hAnsi="Times New Roman" w:eastAsia="宋体"/>
+          <w:b w:val="0"/>
+          <w:color w:val="000000"/>
+          <w:sz w:val="24"/>
+        </w:rPr>
+        <w:t>在所有对标对象中，工行手机银行自有的“星青年Online”年轻新客专区与本项目表面相似度最高，但两者属于两种产品范式，这也是本项目区别于星青年的根本所在。星青年Online是任务型（Task-based）获客产品：以“新客见面礼—开卡—绑卡—首消—邀请”等离散任务和工银i豆即时奖励，驱动用户完成一次性开户与首用行为，用户是“领取任务的玩家”，每条角色线仅两三个步骤、做完即止，无连续周期、无剧情、无认知递进，任务完成即关系结束，留存依赖运营不断上新任务。</w:t>
+      </w:r>
+      <w:r>
+        <w:rPr>
+          <w:rFonts w:ascii="Times New Roman" w:hAnsi="Times New Roman" w:eastAsia="宋体"/>
+          <w:b/>
+          <w:bCs/>
+          <w:color w:val="000000"/>
+          <w:sz w:val="24"/>
+        </w:rPr>
+        <w:t>21天财富剧本是</w:t>
+      </w:r>
+      <w:r>
+        <w:rPr>
+          <w:rFonts w:ascii="Times New Roman" w:hAnsi="Times New Roman" w:eastAsia="宋体"/>
+          <w:b/>
+          <w:bCs/>
+          <w:color w:val="000000"/>
+          <w:sz w:val="24"/>
+        </w:rPr>
+        <w:t>养成型（Growth-based）留客产品：</w:t>
+      </w:r>
+      <w:r>
+        <w:rPr>
+          <w:rFonts w:ascii="Times New Roman" w:hAnsi="Times New Roman" w:eastAsia="宋体"/>
+          <w:b w:val="0"/>
+          <w:color w:val="000000"/>
+          <w:sz w:val="24"/>
+        </w:rPr>
+        <w:t>以连续21天的三幕式剧情（觉醒—积累—守护）、目标可视化成长（小家从毛坯到温馨、旅行地图逐点点亮）和熟人小队陪伴，驱动用户完成“攒钱习惯养成—理财认知升级—投资行为转化”的完整闭环，用户是“陪伴目标成长的主角”，每天推进的不是任务清单而是自己的人生故事，21天毕业不是关系终点而是理财人生的起点，用户与工行之间沉淀的是情感账户而非一次性交易。一句话概括：星青年Online解决“让年轻人走进工行”，</w:t>
+      </w:r>
+      <w:r>
+        <w:rPr>
+          <w:rFonts w:ascii="Times New Roman" w:hAnsi="Times New Roman" w:eastAsia="宋体"/>
+          <w:b/>
+          <w:bCs/>
+          <w:color w:val="000000"/>
+          <w:sz w:val="24"/>
+        </w:rPr>
+        <w:t>本项目解决“让走进工行的年轻人留下来理财”</w:t>
+      </w:r>
+      <w:r>
+        <w:rPr>
+          <w:rFonts w:ascii="Times New Roman" w:hAnsi="Times New Roman" w:eastAsia="宋体"/>
+          <w:b w:val="0"/>
+          <w:color w:val="000000"/>
+          <w:sz w:val="24"/>
+        </w:rPr>
+        <w:t>——前者是获客入口，后者是留客养成引擎，两者在用户旅程上形成接力，而非竞争。</w:t>
+      </w:r>
+    </w:p>
+    <w:p>
+      <w:pPr>
+        <w:pStyle w:val="4"/>
+        <w:keepNext/>
+        <w:pBdr>
+          <w:left w:val="single" w:color="FFC93C" w:sz="18" w:space="4"/>
+        </w:pBdr>
+        <w:spacing w:before="220" w:after="100"/>
+      </w:pPr>
+      <w:r>
+        <w:rPr>
+          <w:rFonts w:ascii="Times New Roman" w:hAnsi="Times New Roman" w:eastAsia="黑体"/>
+          <w:b/>
+          <w:color w:val="1E2A4A"/>
+          <w:sz w:val="28"/>
+        </w:rPr>
+        <w:t>2.4 用户分析</w:t>
+      </w:r>
+    </w:p>
+    <w:p>
+      <w:pPr>
+        <w:spacing w:before="0" w:after="0" w:line="360" w:lineRule="auto"/>
+        <w:ind w:firstLine="480"/>
+      </w:pPr>
+      <w:r>
+        <w:rPr>
+          <w:rFonts w:ascii="Times New Roman" w:hAnsi="Times New Roman" w:eastAsia="宋体"/>
+          <w:b w:val="0"/>
+          <w:color w:val="000000"/>
+          <w:sz w:val="24"/>
+        </w:rPr>
+        <w:t>为避免“自嗨式”设计，团队在2026年8至9月围绕“年轻人的理财意愿、现实障碍与陪伴式产品偏好”开展了一手调研。调研采用线上与线下相结合的方式：线上通过高校社群和社交平台发放电子问卷，线下在高校校园</w:t>
+      </w:r>
+      <w:r>
+        <w:rPr>
+          <w:rFonts w:hint="eastAsia" w:ascii="Times New Roman" w:hAnsi="Times New Roman" w:eastAsia="宋体"/>
+          <w:b w:val="0"/>
+          <w:color w:val="000000"/>
+          <w:sz w:val="24"/>
+          <w:lang w:val="en-US" w:eastAsia="zh-CN"/>
+        </w:rPr>
+        <w:t>与</w:t>
+      </w:r>
+      <w:r>
+        <w:rPr>
+          <w:rFonts w:ascii="Times New Roman" w:hAnsi="Times New Roman" w:eastAsia="宋体"/>
+          <w:b w:val="0"/>
+          <w:color w:val="000000"/>
+          <w:sz w:val="24"/>
+        </w:rPr>
+        <w:t>青年聚集商圈</w:t>
+      </w:r>
+      <w:r>
+        <w:rPr>
+          <w:rFonts w:hint="eastAsia" w:ascii="Times New Roman" w:hAnsi="Times New Roman" w:eastAsia="宋体"/>
+          <w:b w:val="0"/>
+          <w:color w:val="000000"/>
+          <w:sz w:val="24"/>
+          <w:lang w:val="en-US" w:eastAsia="zh-CN"/>
+        </w:rPr>
+        <w:t>发放</w:t>
+      </w:r>
+      <w:r>
+        <w:rPr>
+          <w:rFonts w:ascii="Times New Roman" w:hAnsi="Times New Roman" w:eastAsia="宋体"/>
+          <w:b w:val="0"/>
+          <w:color w:val="000000"/>
+          <w:sz w:val="24"/>
+        </w:rPr>
+        <w:t>；共发放问卷400份，回收392份，剔除作答时间过短、前后逻辑矛盾的问卷16份，得到有效问卷376份，问卷有效回收率为94.0%。</w:t>
+      </w:r>
+    </w:p>
+    <w:p>
+      <w:pPr>
+        <w:spacing w:before="0" w:after="0" w:line="360" w:lineRule="auto"/>
+        <w:ind w:firstLine="480"/>
+      </w:pPr>
+      <w:r>
+        <w:rPr>
+          <w:rFonts w:ascii="Times New Roman" w:hAnsi="Times New Roman" w:eastAsia="宋体"/>
+          <w:b w:val="0"/>
+          <w:color w:val="000000"/>
+          <w:sz w:val="24"/>
+        </w:rPr>
+        <w:t>在问卷调查基础上，团队从三类目标人群中各选取4名、共12名典型用户，进行了30至45分钟的半结构化深度访谈，重点了解其存钱经历、放弃原因与对游戏化理财的真实顾虑。</w:t>
+      </w:r>
+    </w:p>
+    <w:p>
+      <w:pPr>
+        <w:spacing w:before="0" w:after="80" w:line="360" w:lineRule="auto"/>
+        <w:jc w:val="center"/>
+      </w:pPr>
+      <w:r>
+        <w:rPr>
+          <w:rFonts w:ascii="Times New Roman" w:hAnsi="Times New Roman" w:eastAsia="宋体"/>
+          <w:b w:val="0"/>
+          <w:color w:val="000000"/>
+          <w:sz w:val="21"/>
+        </w:rPr>
+        <w:t>表2　问卷样本结构（N=376）</w:t>
+      </w:r>
+    </w:p>
+    <w:tbl>
+      <w:tblPr>
+        <w:tblStyle w:val="35"/>
+        <w:tblW w:w="0" w:type="auto"/>
+        <w:jc w:val="center"/>
+        <w:tblBorders>
+          <w:top w:val="single" w:color="auto" w:sz="4" w:space="0"/>
+          <w:left w:val="single" w:color="auto" w:sz="4" w:space="0"/>
+          <w:bottom w:val="single" w:color="auto" w:sz="4" w:space="0"/>
+          <w:right w:val="single" w:color="auto" w:sz="4" w:space="0"/>
+          <w:insideH w:val="single" w:color="auto" w:sz="4" w:space="0"/>
+          <w:insideV w:val="single" w:color="auto" w:sz="4" w:space="0"/>
+        </w:tblBorders>
+        <w:tblLayout w:type="autofit"/>
+        <w:tblCellMar>
+          <w:top w:w="0" w:type="dxa"/>
+          <w:left w:w="108" w:type="dxa"/>
+          <w:bottom w:w="0" w:type="dxa"/>
+          <w:right w:w="108" w:type="dxa"/>
+        </w:tblCellMar>
+      </w:tblPr>
+      <w:tblGrid>
+        <w:gridCol w:w="2154"/>
+        <w:gridCol w:w="2381"/>
+        <w:gridCol w:w="2381"/>
+        <w:gridCol w:w="2154"/>
+      </w:tblGrid>
+      <w:tr>
+        <w:tblPrEx>
+          <w:tblBorders>
+            <w:top w:val="single" w:color="auto" w:sz="4" w:space="0"/>
+            <w:left w:val="single" w:color="auto" w:sz="4" w:space="0"/>
+            <w:bottom w:val="single" w:color="auto" w:sz="4" w:space="0"/>
+            <w:right w:val="single" w:color="auto" w:sz="4" w:space="0"/>
+            <w:insideH w:val="single" w:color="auto" w:sz="4" w:space="0"/>
+            <w:insideV w:val="single" w:color="auto" w:sz="4" w:space="0"/>
+          </w:tblBorders>
+          <w:tblCellMar>
+            <w:top w:w="0" w:type="dxa"/>
+            <w:left w:w="108" w:type="dxa"/>
+            <w:bottom w:w="0" w:type="dxa"/>
+            <w:right w:w="108" w:type="dxa"/>
+          </w:tblCellMar>
+        </w:tblPrEx>
+        <w:trPr>
+          <w:tblHeader/>
+          <w:jc w:val="center"/>
+        </w:trPr>
+        <w:tc>
+          <w:tcPr>
+            <w:tcW w:w="2154" w:type="dxa"/>
+            <w:shd w:val="clear" w:color="auto" w:fill="C7000B"/>
+            <w:vAlign w:val="center"/>
+          </w:tcPr>
+          <w:p>
+            <w:pPr>
+              <w:spacing w:before="40" w:after="40" w:line="240" w:lineRule="auto"/>
+              <w:ind w:firstLine="0"/>
+              <w:jc w:val="center"/>
+            </w:pPr>
+            <w:r>
+              <w:rPr>
+                <w:rFonts w:ascii="Times New Roman" w:hAnsi="Times New Roman" w:eastAsia="宋体"/>
+                <w:b/>
+                <w:color w:val="FFFFFF"/>
+                <w:sz w:val="21"/>
+              </w:rPr>
               <w:t>人群类别</w:t>
             </w:r>
           </w:p>
@@ -5939,6 +6053,7 @@
               <w:ind w:firstLine="0"/>
               <w:jc w:val="center"/>
             </w:pPr>
+            <w:bookmarkStart w:id="5" w:name="_GoBack" w:colFirst="1" w:colLast="1"/>
             <w:r>
               <w:rPr>
                 <w:rFonts w:ascii="Times New Roman" w:hAnsi="Times New Roman" w:eastAsia="宋体"/>
@@ -6086,6 +6201,7 @@
           </w:p>
         </w:tc>
       </w:tr>
+      <w:bookmarkEnd w:id="5"/>
       <w:tr>
         <w:tblPrEx>
           <w:tblBorders>
@@ -8941,7 +9057,7 @@
                     </pic:cNvPicPr>
                   </pic:nvPicPr>
                   <pic:blipFill>
-                    <a:blip r:embed="rId9"/>
+                    <a:blip r:embed="rId10"/>
                     <a:stretch>
                       <a:fillRect/>
                     </a:stretch>
@@ -9015,7 +9131,7 @@
                     </pic:cNvPicPr>
                   </pic:nvPicPr>
                   <pic:blipFill>
-                    <a:blip r:embed="rId10"/>
+                    <a:blip r:embed="rId11"/>
                     <a:stretch>
                       <a:fillRect/>
                     </a:stretch>
@@ -9149,7 +9265,7 @@
                     </pic:cNvPicPr>
                   </pic:nvPicPr>
                   <pic:blipFill>
-                    <a:blip r:embed="rId11"/>
+                    <a:blip r:embed="rId12"/>
                     <a:stretch>
                       <a:fillRect/>
                     </a:stretch>
@@ -9223,7 +9339,7 @@
                     </pic:cNvPicPr>
                   </pic:nvPicPr>
                   <pic:blipFill>
-                    <a:blip r:embed="rId12"/>
+                    <a:blip r:embed="rId13"/>
                     <a:stretch>
                       <a:fillRect/>
                     </a:stretch>
@@ -9297,7 +9413,7 @@
                     </pic:cNvPicPr>
                   </pic:nvPicPr>
                   <pic:blipFill>
-                    <a:blip r:embed="rId13"/>
+                    <a:blip r:embed="rId14"/>
                     <a:stretch>
                       <a:fillRect/>
                     </a:stretch>
@@ -24705,9 +24821,9 @@
     <w:lsdException w:uiPriority="99" w:name="endnote reference"/>
     <w:lsdException w:uiPriority="99" w:name="endnote text"/>
     <w:lsdException w:uiPriority="99" w:name="table of authorities"/>
-    <w:lsdException w:uiPriority="99" w:semiHidden="0" w:name="macro"/>
+    <w:lsdException w:qFormat="1" w:uiPriority="99" w:semiHidden="0" w:name="macro"/>
     <w:lsdException w:uiPriority="99" w:name="toa heading"/>
-    <w:lsdException w:uiPriority="99" w:semiHidden="0" w:name="List"/>
+    <w:lsdException w:qFormat="1" w:uiPriority="99" w:semiHidden="0" w:name="List"/>
     <w:lsdException w:qFormat="1" w:uiPriority="99" w:semiHidden="0" w:name="List Bullet"/>
     <w:lsdException w:qFormat="1" w:uiPriority="99" w:semiHidden="0" w:name="List Number"/>
     <w:lsdException w:qFormat="1" w:uiPriority="99" w:semiHidden="0" w:name="List 2"/>
@@ -24719,7 +24835,7 @@
     <w:lsdException w:uiPriority="99" w:name="List Bullet 4"/>
     <w:lsdException w:uiPriority="99" w:name="List Bullet 5"/>
     <w:lsdException w:qFormat="1" w:uiPriority="99" w:semiHidden="0" w:name="List Number 2"/>
-    <w:lsdException w:uiPriority="99" w:semiHidden="0" w:name="List Number 3"/>
+    <w:lsdException w:qFormat="1" w:uiPriority="99" w:semiHidden="0" w:name="List Number 3"/>
     <w:lsdException w:uiPriority="99" w:name="List Number 4"/>
     <w:lsdException w:uiPriority="99" w:name="List Number 5"/>
     <w:lsdException w:qFormat="1" w:unhideWhenUsed="0" w:uiPriority="10" w:semiHidden="0" w:name="Title"/>
@@ -24729,8 +24845,8 @@
     <w:lsdException w:qFormat="1" w:uiPriority="99" w:semiHidden="0" w:name="Body Text"/>
     <w:lsdException w:uiPriority="99" w:name="Body Text Indent"/>
     <w:lsdException w:qFormat="1" w:uiPriority="99" w:semiHidden="0" w:name="List Continue"/>
-    <w:lsdException w:uiPriority="99" w:semiHidden="0" w:name="List Continue 2"/>
-    <w:lsdException w:uiPriority="99" w:semiHidden="0" w:name="List Continue 3"/>
+    <w:lsdException w:qFormat="1" w:uiPriority="99" w:semiHidden="0" w:name="List Continue 2"/>
+    <w:lsdException w:qFormat="1" w:uiPriority="99" w:semiHidden="0" w:name="List Continue 3"/>
     <w:lsdException w:uiPriority="99" w:name="List Continue 4"/>
     <w:lsdException w:uiPriority="99" w:name="List Continue 5"/>
     <w:lsdException w:uiPriority="99" w:name="Message Header"/>
@@ -24763,7 +24879,7 @@
     <w:lsdException w:uiPriority="99" w:name="HTML Sample"/>
     <w:lsdException w:uiPriority="99" w:name="HTML Typewriter"/>
     <w:lsdException w:uiPriority="99" w:name="HTML Variable"/>
-    <w:lsdException w:uiPriority="99" w:name="Normal Table"/>
+    <w:lsdException w:qFormat="1" w:uiPriority="99" w:name="Normal Table"/>
     <w:lsdException w:uiPriority="99" w:name="annotation subject"/>
     <w:lsdException w:uiPriority="99" w:name="Table Simple 1"/>
     <w:lsdException w:uiPriority="99" w:name="Table Simple 2"/>
@@ -24811,9 +24927,9 @@
     <w:lsdException w:qFormat="1" w:unhideWhenUsed="0" w:uiPriority="59" w:semiHidden="0" w:name="Table Grid"/>
     <w:lsdException w:uiPriority="99" w:name="Table Theme"/>
     <w:lsdException w:qFormat="1" w:unhideWhenUsed="0" w:uiPriority="1" w:semiHidden="0" w:name="No Spacing"/>
-    <w:lsdException w:unhideWhenUsed="0" w:uiPriority="60" w:semiHidden="0" w:name="Light Shading"/>
+    <w:lsdException w:qFormat="1" w:unhideWhenUsed="0" w:uiPriority="60" w:semiHidden="0" w:name="Light Shading"/>
     <w:lsdException w:qFormat="1" w:unhideWhenUsed="0" w:uiPriority="61" w:semiHidden="0" w:name="Light List"/>
-    <w:lsdException w:unhideWhenUsed="0" w:uiPriority="62" w:semiHidden="0" w:name="Light Grid"/>
+    <w:lsdException w:qFormat="1" w:unhideWhenUsed="0" w:uiPriority="62" w:semiHidden="0" w:name="Light Grid"/>
     <w:lsdException w:qFormat="1" w:unhideWhenUsed="0" w:uiPriority="63" w:semiHidden="0" w:name="Medium Shading 1"/>
     <w:lsdException w:qFormat="1" w:unhideWhenUsed="0" w:uiPriority="64" w:semiHidden="0" w:name="Medium Shading 2"/>
     <w:lsdException w:qFormat="1" w:unhideWhenUsed="0" w:uiPriority="65" w:semiHidden="0" w:name="Medium List 1"/>
@@ -24823,95 +24939,95 @@
     <w:lsdException w:qFormat="1" w:unhideWhenUsed="0" w:uiPriority="69" w:semiHidden="0" w:name="Medium Grid 3"/>
     <w:lsdException w:qFormat="1" w:unhideWhenUsed="0" w:uiPriority="70" w:semiHidden="0" w:name="Dark List"/>
     <w:lsdException w:qFormat="1" w:unhideWhenUsed="0" w:uiPriority="71" w:semiHidden="0" w:name="Colorful Shading"/>
-    <w:lsdException w:unhideWhenUsed="0" w:uiPriority="72" w:semiHidden="0" w:name="Colorful List"/>
+    <w:lsdException w:qFormat="1" w:unhideWhenUsed="0" w:uiPriority="72" w:semiHidden="0" w:name="Colorful List"/>
     <w:lsdException w:qFormat="1" w:unhideWhenUsed="0" w:uiPriority="73" w:semiHidden="0" w:name="Colorful Grid"/>
     <w:lsdException w:qFormat="1" w:unhideWhenUsed="0" w:uiPriority="60" w:semiHidden="0" w:name="Light Shading Accent 1"/>
-    <w:lsdException w:unhideWhenUsed="0" w:uiPriority="61" w:semiHidden="0" w:name="Light List Accent 1"/>
-    <w:lsdException w:unhideWhenUsed="0" w:uiPriority="62" w:semiHidden="0" w:name="Light Grid Accent 1"/>
+    <w:lsdException w:qFormat="1" w:unhideWhenUsed="0" w:uiPriority="61" w:semiHidden="0" w:name="Light List Accent 1"/>
+    <w:lsdException w:qFormat="1" w:unhideWhenUsed="0" w:uiPriority="62" w:semiHidden="0" w:name="Light Grid Accent 1"/>
     <w:lsdException w:qFormat="1" w:unhideWhenUsed="0" w:uiPriority="63" w:semiHidden="0" w:name="Medium Shading 1 Accent 1"/>
     <w:lsdException w:qFormat="1" w:unhideWhenUsed="0" w:uiPriority="64" w:semiHidden="0" w:name="Medium Shading 2 Accent 1"/>
     <w:lsdException w:qFormat="1" w:unhideWhenUsed="0" w:uiPriority="65" w:semiHidden="0" w:name="Medium List 1 Accent 1"/>
     <w:lsdException w:qFormat="1" w:unhideWhenUsed="0" w:uiPriority="34" w:semiHidden="0" w:name="List Paragraph"/>
     <w:lsdException w:qFormat="1" w:unhideWhenUsed="0" w:uiPriority="29" w:semiHidden="0" w:name="Quote"/>
     <w:lsdException w:qFormat="1" w:unhideWhenUsed="0" w:uiPriority="30" w:semiHidden="0" w:name="Intense Quote"/>
-    <w:lsdException w:unhideWhenUsed="0" w:uiPriority="66" w:semiHidden="0" w:name="Medium List 2 Accent 1"/>
+    <w:lsdException w:qFormat="1" w:unhideWhenUsed="0" w:uiPriority="66" w:semiHidden="0" w:name="Medium List 2 Accent 1"/>
     <w:lsdException w:qFormat="1" w:unhideWhenUsed="0" w:uiPriority="67" w:semiHidden="0" w:name="Medium Grid 1 Accent 1"/>
-    <w:lsdException w:unhideWhenUsed="0" w:uiPriority="68" w:semiHidden="0" w:name="Medium Grid 2 Accent 1"/>
+    <w:lsdException w:qFormat="1" w:unhideWhenUsed="0" w:uiPriority="68" w:semiHidden="0" w:name="Medium Grid 2 Accent 1"/>
     <w:lsdException w:qFormat="1" w:unhideWhenUsed="0" w:uiPriority="69" w:semiHidden="0" w:name="Medium Grid 3 Accent 1"/>
     <w:lsdException w:qFormat="1" w:unhideWhenUsed="0" w:uiPriority="70" w:semiHidden="0" w:name="Dark List Accent 1"/>
     <w:lsdException w:qFormat="1" w:unhideWhenUsed="0" w:uiPriority="71" w:semiHidden="0" w:name="Colorful Shading Accent 1"/>
     <w:lsdException w:qFormat="1" w:unhideWhenUsed="0" w:uiPriority="72" w:semiHidden="0" w:name="Colorful List Accent 1"/>
     <w:lsdException w:qFormat="1" w:unhideWhenUsed="0" w:uiPriority="73" w:semiHidden="0" w:name="Colorful Grid Accent 1"/>
-    <w:lsdException w:unhideWhenUsed="0" w:uiPriority="60" w:semiHidden="0" w:name="Light Shading Accent 2"/>
+    <w:lsdException w:qFormat="1" w:unhideWhenUsed="0" w:uiPriority="60" w:semiHidden="0" w:name="Light Shading Accent 2"/>
     <w:lsdException w:qFormat="1" w:unhideWhenUsed="0" w:uiPriority="61" w:semiHidden="0" w:name="Light List Accent 2"/>
-    <w:lsdException w:unhideWhenUsed="0" w:uiPriority="62" w:semiHidden="0" w:name="Light Grid Accent 2"/>
-    <w:lsdException w:unhideWhenUsed="0" w:uiPriority="63" w:semiHidden="0" w:name="Medium Shading 1 Accent 2"/>
+    <w:lsdException w:qFormat="1" w:unhideWhenUsed="0" w:uiPriority="62" w:semiHidden="0" w:name="Light Grid Accent 2"/>
+    <w:lsdException w:qFormat="1" w:unhideWhenUsed="0" w:uiPriority="63" w:semiHidden="0" w:name="Medium Shading 1 Accent 2"/>
     <w:lsdException w:qFormat="1" w:unhideWhenUsed="0" w:uiPriority="64" w:semiHidden="0" w:name="Medium Shading 2 Accent 2"/>
     <w:lsdException w:qFormat="1" w:unhideWhenUsed="0" w:uiPriority="65" w:semiHidden="0" w:name="Medium List 1 Accent 2"/>
     <w:lsdException w:qFormat="1" w:unhideWhenUsed="0" w:uiPriority="66" w:semiHidden="0" w:name="Medium List 2 Accent 2"/>
     <w:lsdException w:qFormat="1" w:unhideWhenUsed="0" w:uiPriority="67" w:semiHidden="0" w:name="Medium Grid 1 Accent 2"/>
     <w:lsdException w:qFormat="1" w:unhideWhenUsed="0" w:uiPriority="68" w:semiHidden="0" w:name="Medium Grid 2 Accent 2"/>
     <w:lsdException w:qFormat="1" w:unhideWhenUsed="0" w:uiPriority="69" w:semiHidden="0" w:name="Medium Grid 3 Accent 2"/>
-    <w:lsdException w:unhideWhenUsed="0" w:uiPriority="70" w:semiHidden="0" w:name="Dark List Accent 2"/>
+    <w:lsdException w:qFormat="1" w:unhideWhenUsed="0" w:uiPriority="70" w:semiHidden="0" w:name="Dark List Accent 2"/>
     <w:lsdException w:qFormat="1" w:unhideWhenUsed="0" w:uiPriority="71" w:semiHidden="0" w:name="Colorful Shading Accent 2"/>
     <w:lsdException w:qFormat="1" w:unhideWhenUsed="0" w:uiPriority="72" w:semiHidden="0" w:name="Colorful List Accent 2"/>
     <w:lsdException w:qFormat="1" w:unhideWhenUsed="0" w:uiPriority="73" w:semiHidden="0" w:name="Colorful Grid Accent 2"/>
     <w:lsdException w:qFormat="1" w:unhideWhenUsed="0" w:uiPriority="60" w:semiHidden="0" w:name="Light Shading Accent 3"/>
-    <w:lsdException w:unhideWhenUsed="0" w:uiPriority="61" w:semiHidden="0" w:name="Light List Accent 3"/>
-    <w:lsdException w:unhideWhenUsed="0" w:uiPriority="62" w:semiHidden="0" w:name="Light Grid Accent 3"/>
+    <w:lsdException w:qFormat="1" w:unhideWhenUsed="0" w:uiPriority="61" w:semiHidden="0" w:name="Light List Accent 3"/>
+    <w:lsdException w:qFormat="1" w:unhideWhenUsed="0" w:uiPriority="62" w:semiHidden="0" w:name="Light Grid Accent 3"/>
     <w:lsdException w:qFormat="1" w:unhideWhenUsed="0" w:uiPriority="63" w:semiHidden="0" w:name="Medium Shading 1 Accent 3"/>
     <w:lsdException w:qFormat="1" w:unhideWhenUsed="0" w:uiPriority="64" w:semiHidden="0" w:name="Medium Shading 2 Accent 3"/>
     <w:lsdException w:qFormat="1" w:unhideWhenUsed="0" w:uiPriority="65" w:semiHidden="0" w:name="Medium List 1 Accent 3"/>
     <w:lsdException w:qFormat="1" w:unhideWhenUsed="0" w:uiPriority="66" w:semiHidden="0" w:name="Medium List 2 Accent 3"/>
-    <w:lsdException w:unhideWhenUsed="0" w:uiPriority="67" w:semiHidden="0" w:name="Medium Grid 1 Accent 3"/>
+    <w:lsdException w:qFormat="1" w:unhideWhenUsed="0" w:uiPriority="67" w:semiHidden="0" w:name="Medium Grid 1 Accent 3"/>
     <w:lsdException w:qFormat="1" w:unhideWhenUsed="0" w:uiPriority="68" w:semiHidden="0" w:name="Medium Grid 2 Accent 3"/>
-    <w:lsdException w:unhideWhenUsed="0" w:uiPriority="69" w:semiHidden="0" w:name="Medium Grid 3 Accent 3"/>
-    <w:lsdException w:unhideWhenUsed="0" w:uiPriority="70" w:semiHidden="0" w:name="Dark List Accent 3"/>
+    <w:lsdException w:qFormat="1" w:unhideWhenUsed="0" w:uiPriority="69" w:semiHidden="0" w:name="Medium Grid 3 Accent 3"/>
+    <w:lsdException w:qFormat="1" w:unhideWhenUsed="0" w:uiPriority="70" w:semiHidden="0" w:name="Dark List Accent 3"/>
     <w:lsdException w:qFormat="1" w:unhideWhenUsed="0" w:uiPriority="71" w:semiHidden="0" w:name="Colorful Shading Accent 3"/>
-    <w:lsdException w:unhideWhenUsed="0" w:uiPriority="72" w:semiHidden="0" w:name="Colorful List Accent 3"/>
+    <w:lsdException w:qFormat="1" w:unhideWhenUsed="0" w:uiPriority="72" w:semiHidden="0" w:name="Colorful List Accent 3"/>
     <w:lsdException w:qFormat="1" w:unhideWhenUsed="0" w:uiPriority="73" w:semiHidden="0" w:name="Colorful Grid Accent 3"/>
-    <w:lsdException w:unhideWhenUsed="0" w:uiPriority="60" w:semiHidden="0" w:name="Light Shading Accent 4"/>
-    <w:lsdException w:unhideWhenUsed="0" w:uiPriority="61" w:semiHidden="0" w:name="Light List Accent 4"/>
+    <w:lsdException w:qFormat="1" w:unhideWhenUsed="0" w:uiPriority="60" w:semiHidden="0" w:name="Light Shading Accent 4"/>
+    <w:lsdException w:qFormat="1" w:unhideWhenUsed="0" w:uiPriority="61" w:semiHidden="0" w:name="Light List Accent 4"/>
     <w:lsdException w:qFormat="1" w:unhideWhenUsed="0" w:uiPriority="62" w:semiHidden="0" w:name="Light Grid Accent 4"/>
     <w:lsdException w:qFormat="1" w:unhideWhenUsed="0" w:uiPriority="63" w:semiHidden="0" w:name="Medium Shading 1 Accent 4"/>
     <w:lsdException w:qFormat="1" w:unhideWhenUsed="0" w:uiPriority="64" w:semiHidden="0" w:name="Medium Shading 2 Accent 4"/>
     <w:lsdException w:qFormat="1" w:unhideWhenUsed="0" w:uiPriority="65" w:semiHidden="0" w:name="Medium List 1 Accent 4"/>
-    <w:lsdException w:unhideWhenUsed="0" w:uiPriority="66" w:semiHidden="0" w:name="Medium List 2 Accent 4"/>
-    <w:lsdException w:unhideWhenUsed="0" w:uiPriority="67" w:semiHidden="0" w:name="Medium Grid 1 Accent 4"/>
+    <w:lsdException w:qFormat="1" w:unhideWhenUsed="0" w:uiPriority="66" w:semiHidden="0" w:name="Medium List 2 Accent 4"/>
+    <w:lsdException w:qFormat="1" w:unhideWhenUsed="0" w:uiPriority="67" w:semiHidden="0" w:name="Medium Grid 1 Accent 4"/>
     <w:lsdException w:qFormat="1" w:unhideWhenUsed="0" w:uiPriority="68" w:semiHidden="0" w:name="Medium Grid 2 Accent 4"/>
     <w:lsdException w:qFormat="1" w:unhideWhenUsed="0" w:uiPriority="69" w:semiHidden="0" w:name="Medium Grid 3 Accent 4"/>
     <w:lsdException w:qFormat="1" w:unhideWhenUsed="0" w:uiPriority="70" w:semiHidden="0" w:name="Dark List Accent 4"/>
     <w:lsdException w:qFormat="1" w:unhideWhenUsed="0" w:uiPriority="71" w:semiHidden="0" w:name="Colorful Shading Accent 4"/>
     <w:lsdException w:qFormat="1" w:unhideWhenUsed="0" w:uiPriority="72" w:semiHidden="0" w:name="Colorful List Accent 4"/>
-    <w:lsdException w:unhideWhenUsed="0" w:uiPriority="73" w:semiHidden="0" w:name="Colorful Grid Accent 4"/>
+    <w:lsdException w:qFormat="1" w:unhideWhenUsed="0" w:uiPriority="73" w:semiHidden="0" w:name="Colorful Grid Accent 4"/>
     <w:lsdException w:qFormat="1" w:unhideWhenUsed="0" w:uiPriority="60" w:semiHidden="0" w:name="Light Shading Accent 5"/>
     <w:lsdException w:qFormat="1" w:unhideWhenUsed="0" w:uiPriority="61" w:semiHidden="0" w:name="Light List Accent 5"/>
-    <w:lsdException w:unhideWhenUsed="0" w:uiPriority="62" w:semiHidden="0" w:name="Light Grid Accent 5"/>
-    <w:lsdException w:unhideWhenUsed="0" w:uiPriority="63" w:semiHidden="0" w:name="Medium Shading 1 Accent 5"/>
+    <w:lsdException w:qFormat="1" w:unhideWhenUsed="0" w:uiPriority="62" w:semiHidden="0" w:name="Light Grid Accent 5"/>
+    <w:lsdException w:qFormat="1" w:unhideWhenUsed="0" w:uiPriority="63" w:semiHidden="0" w:name="Medium Shading 1 Accent 5"/>
     <w:lsdException w:qFormat="1" w:unhideWhenUsed="0" w:uiPriority="64" w:semiHidden="0" w:name="Medium Shading 2 Accent 5"/>
     <w:lsdException w:qFormat="1" w:unhideWhenUsed="0" w:uiPriority="65" w:semiHidden="0" w:name="Medium List 1 Accent 5"/>
     <w:lsdException w:unhideWhenUsed="0" w:uiPriority="66" w:semiHidden="0" w:name="Medium List 2 Accent 5"/>
-    <w:lsdException w:unhideWhenUsed="0" w:uiPriority="67" w:semiHidden="0" w:name="Medium Grid 1 Accent 5"/>
+    <w:lsdException w:qFormat="1" w:unhideWhenUsed="0" w:uiPriority="67" w:semiHidden="0" w:name="Medium Grid 1 Accent 5"/>
     <w:lsdException w:qFormat="1" w:unhideWhenUsed="0" w:uiPriority="68" w:semiHidden="0" w:name="Medium Grid 2 Accent 5"/>
-    <w:lsdException w:unhideWhenUsed="0" w:uiPriority="69" w:semiHidden="0" w:name="Medium Grid 3 Accent 5"/>
-    <w:lsdException w:unhideWhenUsed="0" w:uiPriority="70" w:semiHidden="0" w:name="Dark List Accent 5"/>
+    <w:lsdException w:qFormat="1" w:unhideWhenUsed="0" w:uiPriority="69" w:semiHidden="0" w:name="Medium Grid 3 Accent 5"/>
+    <w:lsdException w:qFormat="1" w:unhideWhenUsed="0" w:uiPriority="70" w:semiHidden="0" w:name="Dark List Accent 5"/>
     <w:lsdException w:qFormat="1" w:unhideWhenUsed="0" w:uiPriority="71" w:semiHidden="0" w:name="Colorful Shading Accent 5"/>
     <w:lsdException w:qFormat="1" w:unhideWhenUsed="0" w:uiPriority="72" w:semiHidden="0" w:name="Colorful List Accent 5"/>
     <w:lsdException w:qFormat="1" w:unhideWhenUsed="0" w:uiPriority="73" w:semiHidden="0" w:name="Colorful Grid Accent 5"/>
     <w:lsdException w:qFormat="1" w:unhideWhenUsed="0" w:uiPriority="60" w:semiHidden="0" w:name="Light Shading Accent 6"/>
-    <w:lsdException w:unhideWhenUsed="0" w:uiPriority="61" w:semiHidden="0" w:name="Light List Accent 6"/>
-    <w:lsdException w:unhideWhenUsed="0" w:uiPriority="62" w:semiHidden="0" w:name="Light Grid Accent 6"/>
+    <w:lsdException w:qFormat="1" w:unhideWhenUsed="0" w:uiPriority="61" w:semiHidden="0" w:name="Light List Accent 6"/>
+    <w:lsdException w:qFormat="1" w:unhideWhenUsed="0" w:uiPriority="62" w:semiHidden="0" w:name="Light Grid Accent 6"/>
     <w:lsdException w:qFormat="1" w:unhideWhenUsed="0" w:uiPriority="63" w:semiHidden="0" w:name="Medium Shading 1 Accent 6"/>
-    <w:lsdException w:unhideWhenUsed="0" w:uiPriority="64" w:semiHidden="0" w:name="Medium Shading 2 Accent 6"/>
+    <w:lsdException w:qFormat="1" w:unhideWhenUsed="0" w:uiPriority="64" w:semiHidden="0" w:name="Medium Shading 2 Accent 6"/>
     <w:lsdException w:qFormat="1" w:unhideWhenUsed="0" w:uiPriority="65" w:semiHidden="0" w:name="Medium List 1 Accent 6"/>
     <w:lsdException w:qFormat="1" w:unhideWhenUsed="0" w:uiPriority="66" w:semiHidden="0" w:name="Medium List 2 Accent 6"/>
     <w:lsdException w:qFormat="1" w:unhideWhenUsed="0" w:uiPriority="67" w:semiHidden="0" w:name="Medium Grid 1 Accent 6"/>
-    <w:lsdException w:unhideWhenUsed="0" w:uiPriority="68" w:semiHidden="0" w:name="Medium Grid 2 Accent 6"/>
-    <w:lsdException w:unhideWhenUsed="0" w:uiPriority="69" w:semiHidden="0" w:name="Medium Grid 3 Accent 6"/>
-    <w:lsdException w:unhideWhenUsed="0" w:uiPriority="70" w:semiHidden="0" w:name="Dark List Accent 6"/>
+    <w:lsdException w:qFormat="1" w:unhideWhenUsed="0" w:uiPriority="68" w:semiHidden="0" w:name="Medium Grid 2 Accent 6"/>
+    <w:lsdException w:qFormat="1" w:unhideWhenUsed="0" w:uiPriority="69" w:semiHidden="0" w:name="Medium Grid 3 Accent 6"/>
+    <w:lsdException w:qFormat="1" w:unhideWhenUsed="0" w:uiPriority="70" w:semiHidden="0" w:name="Dark List Accent 6"/>
     <w:lsdException w:qFormat="1" w:unhideWhenUsed="0" w:uiPriority="71" w:semiHidden="0" w:name="Colorful Shading Accent 6"/>
     <w:lsdException w:qFormat="1" w:unhideWhenUsed="0" w:uiPriority="72" w:semiHidden="0" w:name="Colorful List Accent 6"/>
-    <w:lsdException w:unhideWhenUsed="0" w:uiPriority="73" w:semiHidden="0" w:name="Colorful Grid Accent 6"/>
+    <w:lsdException w:qFormat="1" w:unhideWhenUsed="0" w:uiPriority="73" w:semiHidden="0" w:name="Colorful Grid Accent 6"/>
   </w:latentStyles>
   <w:style w:type="paragraph" w:default="1" w:styleId="1">
     <w:name w:val="Normal"/>
@@ -25173,6 +25289,7 @@
     <w:name w:val="Normal Table"/>
     <w:semiHidden/>
     <w:unhideWhenUsed/>
+    <w:qFormat/>
     <w:uiPriority w:val="99"/>
     <w:tblPr>
       <w:tblCellMar>
@@ -25187,6 +25304,7 @@
     <w:name w:val="macro"/>
     <w:link w:val="149"/>
     <w:unhideWhenUsed/>
+    <w:qFormat/>
     <w:uiPriority w:val="99"/>
     <w:pPr>
       <w:tabs>
@@ -25328,6 +25446,7 @@
     <w:name w:val="List Number 3"/>
     <w:basedOn w:val="1"/>
     <w:unhideWhenUsed/>
+    <w:qFormat/>
     <w:uiPriority w:val="99"/>
     <w:pPr>
       <w:numPr>
@@ -25443,6 +25562,7 @@
     <w:name w:val="List"/>
     <w:basedOn w:val="1"/>
     <w:unhideWhenUsed/>
+    <w:qFormat/>
     <w:uiPriority w:val="99"/>
     <w:pPr>
       <w:ind w:left="360" w:hanging="360"/>
@@ -25477,6 +25597,7 @@
     <w:name w:val="List Continue 2"/>
     <w:basedOn w:val="1"/>
     <w:unhideWhenUsed/>
+    <w:qFormat/>
     <w:uiPriority w:val="99"/>
     <w:pPr>
       <w:spacing w:after="120"/>
@@ -25488,6 +25609,7 @@
     <w:name w:val="List Continue 3"/>
     <w:basedOn w:val="1"/>
     <w:unhideWhenUsed/>
+    <w:qFormat/>
     <w:uiPriority w:val="99"/>
     <w:pPr>
       <w:spacing w:after="120"/>
@@ -25546,6 +25668,7 @@
   <w:style w:type="table" w:styleId="36">
     <w:name w:val="Light Shading"/>
     <w:basedOn w:val="34"/>
+    <w:qFormat/>
     <w:uiPriority w:val="60"/>
     <w:pPr>
       <w:spacing w:after="0" w:line="240" w:lineRule="auto"/>
@@ -25745,6 +25868,7 @@
   <w:style w:type="table" w:styleId="38">
     <w:name w:val="Light Shading Accent 2"/>
     <w:basedOn w:val="34"/>
+    <w:qFormat/>
     <w:uiPriority w:val="60"/>
     <w:pPr>
       <w:spacing w:after="0" w:line="240" w:lineRule="auto"/>
@@ -25944,6 +26068,7 @@
   <w:style w:type="table" w:styleId="40">
     <w:name w:val="Light Shading Accent 4"/>
     <w:basedOn w:val="34"/>
+    <w:qFormat/>
     <w:uiPriority w:val="60"/>
     <w:pPr>
       <w:spacing w:after="0" w:line="240" w:lineRule="auto"/>
@@ -26337,6 +26462,7 @@
   <w:style w:type="table" w:styleId="44">
     <w:name w:val="Light List Accent 1"/>
     <w:basedOn w:val="34"/>
+    <w:qFormat/>
     <w:uiPriority w:val="61"/>
     <w:pPr>
       <w:spacing w:after="0" w:line="240" w:lineRule="auto"/>
@@ -26524,6 +26650,7 @@
   <w:style w:type="table" w:styleId="46">
     <w:name w:val="Light List Accent 3"/>
     <w:basedOn w:val="34"/>
+    <w:qFormat/>
     <w:uiPriority w:val="61"/>
     <w:pPr>
       <w:spacing w:after="0" w:line="240" w:lineRule="auto"/>
@@ -26617,6 +26744,7 @@
   <w:style w:type="table" w:styleId="47">
     <w:name w:val="Light List Accent 4"/>
     <w:basedOn w:val="34"/>
+    <w:qFormat/>
     <w:uiPriority w:val="61"/>
     <w:pPr>
       <w:spacing w:after="0" w:line="240" w:lineRule="auto"/>
@@ -26804,6 +26932,7 @@
   <w:style w:type="table" w:styleId="49">
     <w:name w:val="Light List Accent 6"/>
     <w:basedOn w:val="34"/>
+    <w:qFormat/>
     <w:uiPriority w:val="61"/>
     <w:pPr>
       <w:spacing w:after="0" w:line="240" w:lineRule="auto"/>
@@ -26897,6 +27026,7 @@
   <w:style w:type="table" w:styleId="50">
     <w:name w:val="Light Grid"/>
     <w:basedOn w:val="34"/>
+    <w:qFormat/>
     <w:uiPriority w:val="62"/>
     <w:pPr>
       <w:spacing w:after="0" w:line="240" w:lineRule="auto"/>
@@ -27023,6 +27153,7 @@
   <w:style w:type="table" w:styleId="51">
     <w:name w:val="Light Grid Accent 1"/>
     <w:basedOn w:val="34"/>
+    <w:qFormat/>
     <w:uiPriority w:val="62"/>
     <w:pPr>
       <w:spacing w:after="0" w:line="240" w:lineRule="auto"/>
@@ -27149,6 +27280,7 @@
   <w:style w:type="table" w:styleId="52">
     <w:name w:val="Light Grid Accent 2"/>
     <w:basedOn w:val="34"/>
+    <w:qFormat/>
     <w:uiPriority w:val="62"/>
     <w:pPr>
       <w:spacing w:after="0" w:line="240" w:lineRule="auto"/>
@@ -27275,6 +27407,7 @@
   <w:style w:type="table" w:styleId="53">
     <w:name w:val="Light Grid Accent 3"/>
     <w:basedOn w:val="34"/>
+    <w:qFormat/>
     <w:uiPriority w:val="62"/>
     <w:pPr>
       <w:spacing w:after="0" w:line="240" w:lineRule="auto"/>
@@ -27528,6 +27661,7 @@
   <w:style w:type="table" w:styleId="55">
     <w:name w:val="Light Grid Accent 5"/>
     <w:basedOn w:val="34"/>
+    <w:qFormat/>
     <w:uiPriority w:val="62"/>
     <w:pPr>
       <w:spacing w:after="0" w:line="240" w:lineRule="auto"/>
@@ -27654,6 +27788,7 @@
   <w:style w:type="table" w:styleId="56">
     <w:name w:val="Light Grid Accent 6"/>
     <w:basedOn w:val="34"/>
+    <w:qFormat/>
     <w:uiPriority w:val="62"/>
     <w:pPr>
       <w:spacing w:after="0" w:line="240" w:lineRule="auto"/>
@@ -27996,6 +28131,7 @@
   <w:style w:type="table" w:styleId="59">
     <w:name w:val="Medium Shading 1 Accent 2"/>
     <w:basedOn w:val="34"/>
+    <w:qFormat/>
     <w:uiPriority w:val="63"/>
     <w:pPr>
       <w:spacing w:after="0" w:line="240" w:lineRule="auto"/>
@@ -28319,6 +28455,7 @@
   <w:style w:type="table" w:styleId="62">
     <w:name w:val="Medium Shading 1 Accent 5"/>
     <w:basedOn w:val="34"/>
+    <w:qFormat/>
     <w:uiPriority w:val="63"/>
     <w:pPr>
       <w:spacing w:after="0" w:line="240" w:lineRule="auto"/>
@@ -29530,6 +29667,7 @@
   <w:style w:type="table" w:styleId="70">
     <w:name w:val="Medium Shading 2 Accent 6"/>
     <w:basedOn w:val="34"/>
+    <w:qFormat/>
     <w:uiPriority w:val="64"/>
     <w:pPr>
       <w:spacing w:after="0" w:line="240" w:lineRule="auto"/>
@@ -30461,6 +30599,7 @@
   <w:style w:type="table" w:styleId="79">
     <w:name w:val="Medium List 2 Accent 1"/>
     <w:basedOn w:val="34"/>
+    <w:qFormat/>
     <w:uiPriority w:val="66"/>
     <w:pPr>
       <w:spacing w:after="0" w:line="240" w:lineRule="auto"/>
@@ -30850,6 +30989,7 @@
   <w:style w:type="table" w:styleId="82">
     <w:name w:val="Medium List 2 Accent 4"/>
     <w:basedOn w:val="34"/>
+    <w:qFormat/>
     <w:uiPriority w:val="66"/>
     <w:pPr>
       <w:spacing w:after="0" w:line="240" w:lineRule="auto"/>
@@ -31447,6 +31587,7 @@
   <w:style w:type="table" w:styleId="88">
     <w:name w:val="Medium Grid 1 Accent 3"/>
     <w:basedOn w:val="34"/>
+    <w:qFormat/>
     <w:uiPriority w:val="67"/>
     <w:pPr>
       <w:spacing w:after="0" w:line="240" w:lineRule="auto"/>
@@ -31516,6 +31657,7 @@
   <w:style w:type="table" w:styleId="89">
     <w:name w:val="Medium Grid 1 Accent 4"/>
     <w:basedOn w:val="34"/>
+    <w:qFormat/>
     <w:uiPriority w:val="67"/>
     <w:pPr>
       <w:spacing w:after="0" w:line="240" w:lineRule="auto"/>
@@ -31585,6 +31727,7 @@
   <w:style w:type="table" w:styleId="90">
     <w:name w:val="Medium Grid 1 Accent 5"/>
     <w:basedOn w:val="34"/>
+    <w:qFormat/>
     <w:uiPriority w:val="67"/>
     <w:pPr>
       <w:spacing w:after="0" w:line="240" w:lineRule="auto"/>
@@ -31871,6 +32014,7 @@
   <w:style w:type="table" w:styleId="93">
     <w:name w:val="Medium Grid 2 Accent 1"/>
     <w:basedOn w:val="34"/>
+    <w:qFormat/>
     <w:uiPriority w:val="68"/>
     <w:pPr>
       <w:spacing w:after="0" w:line="240" w:lineRule="auto"/>
@@ -32605,6 +32749,7 @@
   <w:style w:type="table" w:styleId="98">
     <w:name w:val="Medium Grid 2 Accent 6"/>
     <w:basedOn w:val="34"/>
+    <w:qFormat/>
     <w:uiPriority w:val="68"/>
     <w:pPr>
       <w:spacing w:after="0" w:line="240" w:lineRule="auto"/>
@@ -33225,6 +33370,7 @@
   <w:style w:type="table" w:styleId="102">
     <w:name w:val="Medium Grid 3 Accent 3"/>
     <w:basedOn w:val="34"/>
+    <w:qFormat/>
     <w:uiPriority w:val="69"/>
     <w:pPr>
       <w:spacing w:after="0" w:line="240" w:lineRule="auto"/>
@@ -33540,6 +33686,7 @@
   <w:style w:type="table" w:styleId="104">
     <w:name w:val="Medium Grid 3 Accent 5"/>
     <w:basedOn w:val="34"/>
+    <w:qFormat/>
     <w:uiPriority w:val="69"/>
     <w:pPr>
       <w:spacing w:after="0" w:line="240" w:lineRule="auto"/>
@@ -33697,6 +33844,7 @@
   <w:style w:type="table" w:styleId="105">
     <w:name w:val="Medium Grid 3 Accent 6"/>
     <w:basedOn w:val="34"/>
+    <w:qFormat/>
     <w:uiPriority w:val="69"/>
     <w:pPr>
       <w:spacing w:after="0" w:line="240" w:lineRule="auto"/>
@@ -34086,6 +34234,7 @@
   <w:style w:type="table" w:styleId="108">
     <w:name w:val="Dark List Accent 2"/>
     <w:basedOn w:val="34"/>
+    <w:qFormat/>
     <w:uiPriority w:val="70"/>
     <w:pPr>
       <w:spacing w:after="0" w:line="240" w:lineRule="auto"/>
@@ -34201,6 +34350,7 @@
   <w:style w:type="table" w:styleId="109">
     <w:name w:val="Dark List Accent 3"/>
     <w:basedOn w:val="34"/>
+    <w:qFormat/>
     <w:uiPriority w:val="70"/>
     <w:pPr>
       <w:spacing w:after="0" w:line="240" w:lineRule="auto"/>
@@ -34432,6 +34582,7 @@
   <w:style w:type="table" w:styleId="111">
     <w:name w:val="Dark List Accent 5"/>
     <w:basedOn w:val="34"/>
+    <w:qFormat/>
     <w:uiPriority w:val="70"/>
     <w:pPr>
       <w:spacing w:after="0" w:line="240" w:lineRule="auto"/>
@@ -34547,6 +34698,7 @@
   <w:style w:type="table" w:styleId="112">
     <w:name w:val="Dark List Accent 6"/>
     <w:basedOn w:val="34"/>
+    <w:qFormat/>
     <w:uiPriority w:val="70"/>
     <w:pPr>
       <w:spacing w:after="0" w:line="240" w:lineRule="auto"/>
@@ -35685,6 +35837,7 @@
   <w:style w:type="table" w:styleId="120">
     <w:name w:val="Colorful List"/>
     <w:basedOn w:val="34"/>
+    <w:qFormat/>
     <w:uiPriority w:val="72"/>
     <w:pPr>
       <w:spacing w:after="0" w:line="240" w:lineRule="auto"/>
@@ -35963,6 +36116,7 @@
   <w:style w:type="table" w:styleId="123">
     <w:name w:val="Colorful List Accent 3"/>
     <w:basedOn w:val="34"/>
+    <w:qFormat/>
     <w:uiPriority w:val="72"/>
     <w:pPr>
       <w:spacing w:after="0" w:line="240" w:lineRule="auto"/>
@@ -36722,6 +36876,7 @@
   <w:style w:type="table" w:styleId="131">
     <w:name w:val="Colorful Grid Accent 4"/>
     <w:basedOn w:val="34"/>
+    <w:qFormat/>
     <w:uiPriority w:val="73"/>
     <w:pPr>
       <w:spacing w:after="0" w:line="240" w:lineRule="auto"/>
@@ -36915,6 +37070,7 @@
   <w:style w:type="table" w:styleId="133">
     <w:name w:val="Colorful Grid Accent 6"/>
     <w:basedOn w:val="34"/>
+    <w:qFormat/>
     <w:uiPriority w:val="73"/>
     <w:pPr>
       <w:spacing w:after="0" w:line="240" w:lineRule="auto"/>

</xml_diff>